<commit_message>
Actualiza index y CV
</commit_message>
<xml_diff>
--- a/assets/CV_Juan_Cardona.docx
+++ b/assets/CV_Juan_Cardona.docx
@@ -2,6 +2,35 @@
 <file path=word/document.xml><?xml version="1.0" encoding="utf-8"?>
 <w:document xmlns:wpc="http://schemas.microsoft.com/office/word/2010/wordprocessingCanvas" xmlns:cx="http://schemas.microsoft.com/office/drawing/2014/chartex" xmlns:cx1="http://schemas.microsoft.com/office/drawing/2015/9/8/chartex" xmlns:cx2="http://schemas.microsoft.com/office/drawing/2015/10/21/chartex" xmlns:cx3="http://schemas.microsoft.com/office/drawing/2016/5/9/chartex" xmlns:cx4="http://schemas.microsoft.com/office/drawing/2016/5/10/chartex" xmlns:cx5="http://schemas.microsoft.com/office/drawing/2016/5/11/chartex" xmlns:cx6="http://schemas.microsoft.com/office/drawing/2016/5/12/chartex" xmlns:cx7="http://schemas.microsoft.com/office/drawing/2016/5/13/chartex" xmlns:cx8="http://schemas.microsoft.com/office/drawing/2016/5/14/chartex" xmlns:mc="http://schemas.openxmlformats.org/markup-compatibility/2006" xmlns:aink="http://schemas.microsoft.com/office/drawing/2016/ink" xmlns:am3d="http://schemas.microsoft.com/office/drawing/2017/model3d" xmlns:o="urn:schemas-microsoft-com:office:office" xmlns:oel="http://schemas.microsoft.com/office/2019/extlst" xmlns:r="http://schemas.openxmlformats.org/officeDocument/2006/relationships" xmlns:m="http://schemas.openxmlformats.org/officeDocument/2006/math" xmlns:v="urn:schemas-microsoft-com:vml" xmlns:wp14="http://schemas.microsoft.com/office/word/2010/wordprocessingDrawing" xmlns:wp="http://schemas.openxmlformats.org/drawingml/2006/wordprocessingDrawing" xmlns:w10="urn:schemas-microsoft-com:office:word" xmlns:w="http://schemas.openxmlformats.org/wordprocessingml/2006/main" xmlns:w14="http://schemas.microsoft.com/office/word/2010/wordml" xmlns:w15="http://schemas.microsoft.com/office/word/2012/wordml" xmlns:w16cex="http://schemas.microsoft.com/office/word/2018/wordml/cex" xmlns:w16cid="http://schemas.microsoft.com/office/word/2016/wordml/cid" xmlns:w16="http://schemas.microsoft.com/office/word/2018/wordml" xmlns:w16du="http://schemas.microsoft.com/office/word/2023/wordml/word16du" xmlns:w16sdtdh="http://schemas.microsoft.com/office/word/2020/wordml/sdtdatahash" xmlns:w16sdtfl="http://schemas.microsoft.com/office/word/2024/wordml/sdtformatlock" xmlns:w16se="http://schemas.microsoft.com/office/word/2015/wordml/symex" xmlns:wpg="http://schemas.microsoft.com/office/word/2010/wordprocessingGroup" xmlns:wpi="http://schemas.microsoft.com/office/word/2010/wordprocessingInk" xmlns:wne="http://schemas.microsoft.com/office/word/2006/wordml" xmlns:wps="http://schemas.microsoft.com/office/word/2010/wordprocessingShape" mc:Ignorable="w14 w15 w16se w16cid w16 w16cex w16sdtdh w16sdtfl w16du wp14">
   <w:body>
+    <w:p>
+      <w:pPr>
+        <w:rPr>
+          <w:rFonts w:asciiTheme="majorHAnsi" w:eastAsiaTheme="majorEastAsia" w:hAnsiTheme="majorHAnsi" w:cstheme="majorBidi"/>
+          <w:b/>
+          <w:bCs/>
+          <w:color w:val="1F497D" w:themeColor="text2"/>
+          <w:spacing w:val="5"/>
+          <w:kern w:val="28"/>
+          <w:sz w:val="28"/>
+          <w:szCs w:val="28"/>
+          <w:lang w:val="es-MX"/>
+        </w:rPr>
+      </w:pPr>
+      <w:r>
+        <w:rPr>
+          <w:rFonts w:asciiTheme="majorHAnsi" w:eastAsiaTheme="majorEastAsia" w:hAnsiTheme="majorHAnsi" w:cstheme="majorBidi"/>
+          <w:b/>
+          <w:bCs/>
+          <w:color w:val="1F497D" w:themeColor="text2"/>
+          <w:spacing w:val="5"/>
+          <w:kern w:val="28"/>
+          <w:sz w:val="28"/>
+          <w:szCs w:val="28"/>
+          <w:lang w:val="es-MX"/>
+        </w:rPr>
+        <w:t>JUAN GABRIEL CARDONA BALLESTEROS</w:t>
+      </w:r>
+    </w:p>
     <w:p>
       <w:pPr>
         <w:rPr>
@@ -21,21 +50,7 @@
           <w:rFonts w:asciiTheme="majorHAnsi" w:eastAsiaTheme="majorEastAsia" w:hAnsiTheme="majorHAnsi" w:cstheme="majorBidi"/>
           <w:b/>
           <w:bCs/>
-          <w:color w:val="17365D" w:themeColor="text2" w:themeShade="BF"/>
-          <w:spacing w:val="5"/>
-          <w:kern w:val="28"/>
-          <w:sz w:val="28"/>
-          <w:szCs w:val="28"/>
-          <w:lang w:val="es-MX"/>
-        </w:rPr>
-        <w:t>JUAN GABRIEL CARDONA BALLESTEROS</w:t>
-      </w:r>
-      <w:r>
-        <w:rPr>
-          <w:rFonts w:asciiTheme="majorHAnsi" w:eastAsiaTheme="majorEastAsia" w:hAnsiTheme="majorHAnsi" w:cstheme="majorBidi"/>
-          <w:b/>
-          <w:bCs/>
-          <w:color w:val="17365D" w:themeColor="text2" w:themeShade="BF"/>
+          <w:color w:val="000000" w:themeColor="text1"/>
           <w:spacing w:val="5"/>
           <w:kern w:val="28"/>
           <w:sz w:val="28"/>
@@ -50,7 +65,7 @@
           <w:rFonts w:asciiTheme="majorHAnsi" w:eastAsiaTheme="majorEastAsia" w:hAnsiTheme="majorHAnsi" w:cstheme="majorBidi"/>
           <w:b/>
           <w:bCs/>
-          <w:color w:val="17365D" w:themeColor="text2" w:themeShade="BF"/>
+          <w:color w:val="000000" w:themeColor="text1"/>
           <w:spacing w:val="5"/>
           <w:kern w:val="28"/>
           <w:sz w:val="28"/>
@@ -64,6 +79,7 @@
           <w:rFonts w:asciiTheme="majorHAnsi" w:eastAsiaTheme="majorEastAsia" w:hAnsiTheme="majorHAnsi" w:cstheme="majorBidi"/>
           <w:b/>
           <w:bCs/>
+          <w:color w:val="000000" w:themeColor="text1"/>
           <w:spacing w:val="5"/>
           <w:kern w:val="28"/>
           <w:sz w:val="28"/>
@@ -77,7 +93,7 @@
           <w:rFonts w:asciiTheme="majorHAnsi" w:eastAsiaTheme="majorEastAsia" w:hAnsiTheme="majorHAnsi" w:cstheme="majorBidi"/>
           <w:b/>
           <w:bCs/>
-          <w:color w:val="17365D" w:themeColor="text2" w:themeShade="BF"/>
+          <w:color w:val="000000" w:themeColor="text1"/>
           <w:spacing w:val="5"/>
           <w:kern w:val="28"/>
           <w:sz w:val="28"/>
@@ -185,7 +201,7 @@
           <w:rFonts w:asciiTheme="majorHAnsi" w:eastAsiaTheme="majorEastAsia" w:hAnsiTheme="majorHAnsi" w:cstheme="majorBidi"/>
           <w:b/>
           <w:bCs/>
-          <w:color w:val="17365D" w:themeColor="text2" w:themeShade="BF"/>
+          <w:color w:val="1F497D" w:themeColor="text2"/>
           <w:spacing w:val="5"/>
           <w:kern w:val="28"/>
           <w:sz w:val="28"/>
@@ -198,7 +214,7 @@
           <w:rFonts w:asciiTheme="majorHAnsi" w:eastAsiaTheme="majorEastAsia" w:hAnsiTheme="majorHAnsi" w:cstheme="majorBidi"/>
           <w:b/>
           <w:bCs/>
-          <w:color w:val="17365D" w:themeColor="text2" w:themeShade="BF"/>
+          <w:color w:val="1F497D" w:themeColor="text2"/>
           <w:spacing w:val="5"/>
           <w:kern w:val="28"/>
           <w:sz w:val="28"/>
@@ -214,7 +230,7 @@
           <w:rFonts w:asciiTheme="majorHAnsi" w:eastAsiaTheme="majorEastAsia" w:hAnsiTheme="majorHAnsi" w:cstheme="majorBidi"/>
           <w:b/>
           <w:bCs/>
-          <w:color w:val="17365D" w:themeColor="text2" w:themeShade="BF"/>
+          <w:color w:val="000000" w:themeColor="text1"/>
           <w:spacing w:val="5"/>
           <w:kern w:val="28"/>
           <w:sz w:val="28"/>
@@ -227,7 +243,7 @@
           <w:rFonts w:asciiTheme="majorHAnsi" w:eastAsiaTheme="majorEastAsia" w:hAnsiTheme="majorHAnsi" w:cstheme="majorBidi"/>
           <w:b/>
           <w:bCs/>
-          <w:color w:val="17365D" w:themeColor="text2" w:themeShade="BF"/>
+          <w:color w:val="000000" w:themeColor="text1"/>
           <w:spacing w:val="5"/>
           <w:kern w:val="28"/>
           <w:sz w:val="28"/>
@@ -243,7 +259,7 @@
           <w:rFonts w:asciiTheme="majorHAnsi" w:eastAsiaTheme="majorEastAsia" w:hAnsiTheme="majorHAnsi" w:cstheme="majorBidi"/>
           <w:b/>
           <w:bCs/>
-          <w:color w:val="17365D" w:themeColor="text2" w:themeShade="BF"/>
+          <w:color w:val="000000" w:themeColor="text1"/>
           <w:spacing w:val="5"/>
           <w:kern w:val="28"/>
           <w:sz w:val="28"/>
@@ -256,7 +272,7 @@
           <w:rFonts w:asciiTheme="majorHAnsi" w:eastAsiaTheme="majorEastAsia" w:hAnsiTheme="majorHAnsi" w:cstheme="majorBidi"/>
           <w:b/>
           <w:bCs/>
-          <w:color w:val="17365D" w:themeColor="text2" w:themeShade="BF"/>
+          <w:color w:val="000000" w:themeColor="text1"/>
           <w:spacing w:val="5"/>
           <w:kern w:val="28"/>
           <w:sz w:val="28"/>
@@ -271,7 +287,7 @@
           <w:rFonts w:asciiTheme="majorHAnsi" w:eastAsiaTheme="majorEastAsia" w:hAnsiTheme="majorHAnsi" w:cstheme="majorBidi"/>
           <w:b/>
           <w:bCs/>
-          <w:color w:val="17365D" w:themeColor="text2" w:themeShade="BF"/>
+          <w:color w:val="000000" w:themeColor="text1"/>
           <w:spacing w:val="5"/>
           <w:kern w:val="28"/>
           <w:sz w:val="28"/>
@@ -286,7 +302,7 @@
           <w:rFonts w:asciiTheme="majorHAnsi" w:eastAsiaTheme="majorEastAsia" w:hAnsiTheme="majorHAnsi" w:cstheme="majorBidi"/>
           <w:b/>
           <w:bCs/>
-          <w:color w:val="17365D" w:themeColor="text2" w:themeShade="BF"/>
+          <w:color w:val="000000" w:themeColor="text1"/>
           <w:spacing w:val="5"/>
           <w:kern w:val="28"/>
           <w:sz w:val="28"/>
@@ -301,7 +317,7 @@
           <w:rFonts w:asciiTheme="majorHAnsi" w:eastAsiaTheme="majorEastAsia" w:hAnsiTheme="majorHAnsi" w:cstheme="majorBidi"/>
           <w:b/>
           <w:bCs/>
-          <w:color w:val="17365D" w:themeColor="text2" w:themeShade="BF"/>
+          <w:color w:val="000000" w:themeColor="text1"/>
           <w:spacing w:val="5"/>
           <w:kern w:val="28"/>
           <w:sz w:val="28"/>
@@ -316,7 +332,7 @@
           <w:rFonts w:asciiTheme="majorHAnsi" w:eastAsiaTheme="majorEastAsia" w:hAnsiTheme="majorHAnsi" w:cstheme="majorBidi"/>
           <w:b/>
           <w:bCs/>
-          <w:color w:val="17365D" w:themeColor="text2" w:themeShade="BF"/>
+          <w:color w:val="000000" w:themeColor="text1"/>
           <w:spacing w:val="5"/>
           <w:kern w:val="28"/>
           <w:sz w:val="28"/>
@@ -363,7 +379,7 @@
           <w:rFonts w:asciiTheme="majorHAnsi" w:eastAsiaTheme="majorEastAsia" w:hAnsiTheme="majorHAnsi" w:cstheme="majorBidi"/>
           <w:b/>
           <w:bCs/>
-          <w:color w:val="17365D" w:themeColor="text2" w:themeShade="BF"/>
+          <w:color w:val="1F497D" w:themeColor="text2"/>
           <w:spacing w:val="5"/>
           <w:kern w:val="28"/>
           <w:sz w:val="28"/>
@@ -376,7 +392,7 @@
           <w:rFonts w:asciiTheme="majorHAnsi" w:eastAsiaTheme="majorEastAsia" w:hAnsiTheme="majorHAnsi" w:cstheme="majorBidi"/>
           <w:b/>
           <w:bCs/>
-          <w:color w:val="17365D" w:themeColor="text2" w:themeShade="BF"/>
+          <w:color w:val="1F497D" w:themeColor="text2"/>
           <w:spacing w:val="5"/>
           <w:kern w:val="28"/>
           <w:sz w:val="28"/>
@@ -392,7 +408,7 @@
           <w:rFonts w:asciiTheme="majorHAnsi" w:eastAsiaTheme="majorEastAsia" w:hAnsiTheme="majorHAnsi" w:cstheme="majorBidi"/>
           <w:b/>
           <w:bCs/>
-          <w:color w:val="17365D" w:themeColor="text2" w:themeShade="BF"/>
+          <w:color w:val="000000" w:themeColor="text1"/>
           <w:spacing w:val="5"/>
           <w:kern w:val="28"/>
           <w:sz w:val="28"/>
@@ -405,7 +421,7 @@
           <w:rFonts w:asciiTheme="majorHAnsi" w:eastAsiaTheme="majorEastAsia" w:hAnsiTheme="majorHAnsi" w:cstheme="majorBidi"/>
           <w:b/>
           <w:bCs/>
-          <w:color w:val="17365D" w:themeColor="text2" w:themeShade="BF"/>
+          <w:color w:val="000000" w:themeColor="text1"/>
           <w:spacing w:val="5"/>
           <w:kern w:val="28"/>
           <w:sz w:val="28"/>
@@ -419,7 +435,7 @@
           <w:rFonts w:asciiTheme="majorHAnsi" w:eastAsiaTheme="majorEastAsia" w:hAnsiTheme="majorHAnsi" w:cstheme="majorBidi"/>
           <w:b/>
           <w:bCs/>
-          <w:color w:val="17365D" w:themeColor="text2" w:themeShade="BF"/>
+          <w:color w:val="000000" w:themeColor="text1"/>
           <w:spacing w:val="5"/>
           <w:kern w:val="28"/>
           <w:sz w:val="28"/>
@@ -434,7 +450,7 @@
           <w:rFonts w:asciiTheme="majorHAnsi" w:eastAsiaTheme="majorEastAsia" w:hAnsiTheme="majorHAnsi" w:cstheme="majorBidi"/>
           <w:b/>
           <w:bCs/>
-          <w:color w:val="17365D" w:themeColor="text2" w:themeShade="BF"/>
+          <w:color w:val="000000" w:themeColor="text1"/>
           <w:spacing w:val="5"/>
           <w:kern w:val="28"/>
           <w:sz w:val="28"/>
@@ -449,7 +465,7 @@
           <w:rFonts w:asciiTheme="majorHAnsi" w:eastAsiaTheme="majorEastAsia" w:hAnsiTheme="majorHAnsi" w:cstheme="majorBidi"/>
           <w:b/>
           <w:bCs/>
-          <w:color w:val="17365D" w:themeColor="text2" w:themeShade="BF"/>
+          <w:color w:val="000000" w:themeColor="text1"/>
           <w:spacing w:val="5"/>
           <w:kern w:val="28"/>
           <w:sz w:val="28"/>
@@ -464,7 +480,7 @@
           <w:rFonts w:asciiTheme="majorHAnsi" w:eastAsiaTheme="majorEastAsia" w:hAnsiTheme="majorHAnsi" w:cstheme="majorBidi"/>
           <w:b/>
           <w:bCs/>
-          <w:color w:val="17365D" w:themeColor="text2" w:themeShade="BF"/>
+          <w:color w:val="000000" w:themeColor="text1"/>
           <w:spacing w:val="5"/>
           <w:kern w:val="28"/>
           <w:sz w:val="28"/>
@@ -480,7 +496,7 @@
           <w:rFonts w:asciiTheme="majorHAnsi" w:eastAsiaTheme="majorEastAsia" w:hAnsiTheme="majorHAnsi" w:cstheme="majorBidi"/>
           <w:b/>
           <w:bCs/>
-          <w:color w:val="17365D" w:themeColor="text2" w:themeShade="BF"/>
+          <w:color w:val="000000" w:themeColor="text1"/>
           <w:spacing w:val="5"/>
           <w:kern w:val="28"/>
           <w:sz w:val="28"/>
@@ -495,7 +511,7 @@
           <w:rFonts w:asciiTheme="majorHAnsi" w:eastAsiaTheme="majorEastAsia" w:hAnsiTheme="majorHAnsi" w:cstheme="majorBidi"/>
           <w:b/>
           <w:bCs/>
-          <w:color w:val="17365D" w:themeColor="text2" w:themeShade="BF"/>
+          <w:color w:val="000000" w:themeColor="text1"/>
           <w:spacing w:val="5"/>
           <w:kern w:val="28"/>
           <w:sz w:val="28"/>
@@ -511,7 +527,7 @@
           <w:rFonts w:asciiTheme="majorHAnsi" w:eastAsiaTheme="majorEastAsia" w:hAnsiTheme="majorHAnsi" w:cstheme="majorBidi"/>
           <w:b/>
           <w:bCs/>
-          <w:color w:val="17365D" w:themeColor="text2" w:themeShade="BF"/>
+          <w:color w:val="000000" w:themeColor="text1"/>
           <w:spacing w:val="5"/>
           <w:kern w:val="28"/>
           <w:sz w:val="28"/>
@@ -526,14 +542,29 @@
           <w:rFonts w:asciiTheme="majorHAnsi" w:eastAsiaTheme="majorEastAsia" w:hAnsiTheme="majorHAnsi" w:cstheme="majorBidi"/>
           <w:b/>
           <w:bCs/>
-          <w:color w:val="17365D" w:themeColor="text2" w:themeShade="BF"/>
+          <w:color w:val="000000" w:themeColor="text1"/>
           <w:spacing w:val="5"/>
           <w:kern w:val="28"/>
           <w:sz w:val="28"/>
           <w:szCs w:val="28"/>
           <w:lang w:val="es-MX"/>
         </w:rPr>
-        <w:t xml:space="preserve"> (machine </w:t>
+        <w:t xml:space="preserve"> </w:t>
+      </w:r>
+      <w:r>
+        <w:rPr>
+          <w:rFonts w:asciiTheme="majorHAnsi" w:eastAsiaTheme="majorEastAsia" w:hAnsiTheme="majorHAnsi" w:cstheme="majorBidi"/>
+          <w:b/>
+          <w:bCs/>
+          <w:color w:val="000000" w:themeColor="text1"/>
+          <w:spacing w:val="5"/>
+          <w:kern w:val="28"/>
+          <w:sz w:val="28"/>
+          <w:szCs w:val="28"/>
+          <w:lang w:val="es-MX"/>
+        </w:rPr>
+        <w:lastRenderedPageBreak/>
+        <w:t xml:space="preserve">(machine </w:t>
       </w:r>
       <w:proofErr w:type="spellStart"/>
       <w:r>
@@ -541,7 +572,7 @@
           <w:rFonts w:asciiTheme="majorHAnsi" w:eastAsiaTheme="majorEastAsia" w:hAnsiTheme="majorHAnsi" w:cstheme="majorBidi"/>
           <w:b/>
           <w:bCs/>
-          <w:color w:val="17365D" w:themeColor="text2" w:themeShade="BF"/>
+          <w:color w:val="000000" w:themeColor="text1"/>
           <w:spacing w:val="5"/>
           <w:kern w:val="28"/>
           <w:sz w:val="28"/>
@@ -556,7 +587,7 @@
           <w:rFonts w:asciiTheme="majorHAnsi" w:eastAsiaTheme="majorEastAsia" w:hAnsiTheme="majorHAnsi" w:cstheme="majorBidi"/>
           <w:b/>
           <w:bCs/>
-          <w:color w:val="17365D" w:themeColor="text2" w:themeShade="BF"/>
+          <w:color w:val="000000" w:themeColor="text1"/>
           <w:spacing w:val="5"/>
           <w:kern w:val="28"/>
           <w:sz w:val="28"/>
@@ -570,7 +601,7 @@
           <w:rFonts w:asciiTheme="majorHAnsi" w:eastAsiaTheme="majorEastAsia" w:hAnsiTheme="majorHAnsi" w:cstheme="majorBidi"/>
           <w:b/>
           <w:bCs/>
-          <w:color w:val="17365D" w:themeColor="text2" w:themeShade="BF"/>
+          <w:color w:val="000000" w:themeColor="text1"/>
           <w:spacing w:val="5"/>
           <w:kern w:val="28"/>
           <w:sz w:val="28"/>
@@ -578,20 +609,6 @@
           <w:lang w:val="es-MX"/>
         </w:rPr>
         <w:br/>
-      </w:r>
-      <w:r>
-        <w:rPr>
-          <w:rFonts w:asciiTheme="majorHAnsi" w:eastAsiaTheme="majorEastAsia" w:hAnsiTheme="majorHAnsi" w:cstheme="majorBidi"/>
-          <w:b/>
-          <w:bCs/>
-          <w:color w:val="17365D" w:themeColor="text2" w:themeShade="BF"/>
-          <w:spacing w:val="5"/>
-          <w:kern w:val="28"/>
-          <w:sz w:val="28"/>
-          <w:szCs w:val="28"/>
-          <w:lang w:val="es-MX"/>
-        </w:rPr>
-        <w:lastRenderedPageBreak/>
         <w:t>Inteligencia artificial: Fundamentos de redes neuronales</w:t>
       </w:r>
       <w:r>
@@ -599,7 +616,7 @@
           <w:rFonts w:asciiTheme="majorHAnsi" w:eastAsiaTheme="majorEastAsia" w:hAnsiTheme="majorHAnsi" w:cstheme="majorBidi"/>
           <w:b/>
           <w:bCs/>
-          <w:color w:val="17365D" w:themeColor="text2" w:themeShade="BF"/>
+          <w:color w:val="000000" w:themeColor="text1"/>
           <w:spacing w:val="5"/>
           <w:kern w:val="28"/>
           <w:sz w:val="28"/>
@@ -614,7 +631,7 @@
           <w:rFonts w:asciiTheme="majorHAnsi" w:eastAsiaTheme="majorEastAsia" w:hAnsiTheme="majorHAnsi" w:cstheme="majorBidi"/>
           <w:b/>
           <w:bCs/>
-          <w:color w:val="17365D" w:themeColor="text2" w:themeShade="BF"/>
+          <w:color w:val="000000" w:themeColor="text1"/>
           <w:spacing w:val="5"/>
           <w:kern w:val="28"/>
           <w:sz w:val="28"/>
@@ -630,7 +647,7 @@
           <w:rFonts w:asciiTheme="majorHAnsi" w:eastAsiaTheme="majorEastAsia" w:hAnsiTheme="majorHAnsi" w:cstheme="majorBidi"/>
           <w:b/>
           <w:bCs/>
-          <w:color w:val="17365D" w:themeColor="text2" w:themeShade="BF"/>
+          <w:color w:val="000000" w:themeColor="text1"/>
           <w:spacing w:val="5"/>
           <w:kern w:val="28"/>
           <w:sz w:val="28"/>
@@ -647,7 +664,7 @@
           <w:rFonts w:asciiTheme="majorHAnsi" w:eastAsiaTheme="majorEastAsia" w:hAnsiTheme="majorHAnsi" w:cstheme="majorBidi"/>
           <w:b/>
           <w:bCs/>
-          <w:color w:val="17365D" w:themeColor="text2" w:themeShade="BF"/>
+          <w:color w:val="000000" w:themeColor="text1"/>
           <w:spacing w:val="5"/>
           <w:kern w:val="28"/>
           <w:sz w:val="28"/>
@@ -660,7 +677,7 @@
           <w:rFonts w:asciiTheme="majorHAnsi" w:eastAsiaTheme="majorEastAsia" w:hAnsiTheme="majorHAnsi" w:cstheme="majorBidi"/>
           <w:b/>
           <w:bCs/>
-          <w:color w:val="17365D" w:themeColor="text2" w:themeShade="BF"/>
+          <w:color w:val="000000" w:themeColor="text1"/>
           <w:spacing w:val="5"/>
           <w:kern w:val="28"/>
           <w:sz w:val="28"/>
@@ -678,7 +695,7 @@
           <w:rFonts w:asciiTheme="majorHAnsi" w:eastAsiaTheme="majorEastAsia" w:hAnsiTheme="majorHAnsi" w:cstheme="majorBidi"/>
           <w:b/>
           <w:bCs/>
-          <w:color w:val="17365D" w:themeColor="text2" w:themeShade="BF"/>
+          <w:color w:val="1F497D" w:themeColor="text2"/>
           <w:spacing w:val="5"/>
           <w:kern w:val="28"/>
           <w:sz w:val="28"/>
@@ -691,7 +708,7 @@
           <w:rFonts w:asciiTheme="majorHAnsi" w:eastAsiaTheme="majorEastAsia" w:hAnsiTheme="majorHAnsi" w:cstheme="majorBidi"/>
           <w:b/>
           <w:bCs/>
-          <w:color w:val="17365D" w:themeColor="text2" w:themeShade="BF"/>
+          <w:color w:val="1F497D" w:themeColor="text2"/>
           <w:spacing w:val="5"/>
           <w:kern w:val="28"/>
           <w:sz w:val="28"/>
@@ -707,7 +724,7 @@
           <w:rFonts w:asciiTheme="majorHAnsi" w:eastAsiaTheme="majorEastAsia" w:hAnsiTheme="majorHAnsi" w:cstheme="majorBidi"/>
           <w:b/>
           <w:bCs/>
-          <w:color w:val="17365D" w:themeColor="text2" w:themeShade="BF"/>
+          <w:color w:val="000000" w:themeColor="text1"/>
           <w:spacing w:val="5"/>
           <w:kern w:val="28"/>
           <w:sz w:val="28"/>
@@ -720,7 +737,7 @@
           <w:rFonts w:asciiTheme="majorHAnsi" w:eastAsiaTheme="majorEastAsia" w:hAnsiTheme="majorHAnsi" w:cstheme="majorBidi"/>
           <w:b/>
           <w:bCs/>
-          <w:color w:val="17365D" w:themeColor="text2" w:themeShade="BF"/>
+          <w:color w:val="000000" w:themeColor="text1"/>
           <w:spacing w:val="5"/>
           <w:kern w:val="28"/>
           <w:sz w:val="28"/>
@@ -740,7 +757,7 @@
           <w:rFonts w:asciiTheme="majorHAnsi" w:eastAsiaTheme="majorEastAsia" w:hAnsiTheme="majorHAnsi" w:cstheme="majorBidi"/>
           <w:b/>
           <w:bCs/>
-          <w:color w:val="17365D" w:themeColor="text2" w:themeShade="BF"/>
+          <w:color w:val="000000" w:themeColor="text1"/>
           <w:spacing w:val="5"/>
           <w:kern w:val="28"/>
           <w:sz w:val="28"/>
@@ -753,7 +770,7 @@
           <w:rFonts w:asciiTheme="majorHAnsi" w:eastAsiaTheme="majorEastAsia" w:hAnsiTheme="majorHAnsi" w:cstheme="majorBidi"/>
           <w:b/>
           <w:bCs/>
-          <w:color w:val="17365D" w:themeColor="text2" w:themeShade="BF"/>
+          <w:color w:val="000000" w:themeColor="text1"/>
           <w:spacing w:val="5"/>
           <w:kern w:val="28"/>
           <w:sz w:val="28"/>
@@ -773,7 +790,7 @@
           <w:rFonts w:asciiTheme="majorHAnsi" w:eastAsiaTheme="majorEastAsia" w:hAnsiTheme="majorHAnsi" w:cstheme="majorBidi"/>
           <w:b/>
           <w:bCs/>
-          <w:color w:val="17365D" w:themeColor="text2" w:themeShade="BF"/>
+          <w:color w:val="000000" w:themeColor="text1"/>
           <w:spacing w:val="5"/>
           <w:kern w:val="28"/>
           <w:sz w:val="28"/>
@@ -786,7 +803,7 @@
           <w:rFonts w:asciiTheme="majorHAnsi" w:eastAsiaTheme="majorEastAsia" w:hAnsiTheme="majorHAnsi" w:cstheme="majorBidi"/>
           <w:b/>
           <w:bCs/>
-          <w:color w:val="17365D" w:themeColor="text2" w:themeShade="BF"/>
+          <w:color w:val="000000" w:themeColor="text1"/>
           <w:spacing w:val="5"/>
           <w:kern w:val="28"/>
           <w:sz w:val="28"/>
@@ -806,7 +823,7 @@
           <w:rFonts w:asciiTheme="majorHAnsi" w:eastAsiaTheme="majorEastAsia" w:hAnsiTheme="majorHAnsi" w:cstheme="majorBidi"/>
           <w:b/>
           <w:bCs/>
-          <w:color w:val="17365D" w:themeColor="text2" w:themeShade="BF"/>
+          <w:color w:val="000000" w:themeColor="text1"/>
           <w:spacing w:val="5"/>
           <w:kern w:val="28"/>
           <w:sz w:val="28"/>
@@ -819,7 +836,7 @@
           <w:rFonts w:asciiTheme="majorHAnsi" w:eastAsiaTheme="majorEastAsia" w:hAnsiTheme="majorHAnsi" w:cstheme="majorBidi"/>
           <w:b/>
           <w:bCs/>
-          <w:color w:val="17365D" w:themeColor="text2" w:themeShade="BF"/>
+          <w:color w:val="000000" w:themeColor="text1"/>
           <w:spacing w:val="5"/>
           <w:kern w:val="28"/>
           <w:sz w:val="28"/>
@@ -834,7 +851,7 @@
           <w:rFonts w:asciiTheme="majorHAnsi" w:eastAsiaTheme="majorEastAsia" w:hAnsiTheme="majorHAnsi" w:cstheme="majorBidi"/>
           <w:b/>
           <w:bCs/>
-          <w:color w:val="17365D" w:themeColor="text2" w:themeShade="BF"/>
+          <w:color w:val="000000" w:themeColor="text1"/>
           <w:spacing w:val="5"/>
           <w:kern w:val="28"/>
           <w:sz w:val="28"/>
@@ -849,7 +866,7 @@
           <w:rFonts w:asciiTheme="majorHAnsi" w:eastAsiaTheme="majorEastAsia" w:hAnsiTheme="majorHAnsi" w:cstheme="majorBidi"/>
           <w:b/>
           <w:bCs/>
-          <w:color w:val="17365D" w:themeColor="text2" w:themeShade="BF"/>
+          <w:color w:val="000000" w:themeColor="text1"/>
           <w:spacing w:val="5"/>
           <w:kern w:val="28"/>
           <w:sz w:val="28"/>
@@ -864,7 +881,7 @@
           <w:rFonts w:asciiTheme="majorHAnsi" w:eastAsiaTheme="majorEastAsia" w:hAnsiTheme="majorHAnsi" w:cstheme="majorBidi"/>
           <w:b/>
           <w:bCs/>
-          <w:color w:val="17365D" w:themeColor="text2" w:themeShade="BF"/>
+          <w:color w:val="000000" w:themeColor="text1"/>
           <w:spacing w:val="5"/>
           <w:kern w:val="28"/>
           <w:sz w:val="28"/>
@@ -879,7 +896,7 @@
           <w:rFonts w:asciiTheme="majorHAnsi" w:eastAsiaTheme="majorEastAsia" w:hAnsiTheme="majorHAnsi" w:cstheme="majorBidi"/>
           <w:b/>
           <w:bCs/>
-          <w:color w:val="17365D" w:themeColor="text2" w:themeShade="BF"/>
+          <w:color w:val="000000" w:themeColor="text1"/>
           <w:spacing w:val="5"/>
           <w:kern w:val="28"/>
           <w:sz w:val="28"/>
@@ -899,7 +916,7 @@
           <w:rFonts w:asciiTheme="majorHAnsi" w:eastAsiaTheme="majorEastAsia" w:hAnsiTheme="majorHAnsi" w:cstheme="majorBidi"/>
           <w:b/>
           <w:bCs/>
-          <w:color w:val="17365D" w:themeColor="text2" w:themeShade="BF"/>
+          <w:color w:val="000000" w:themeColor="text1"/>
           <w:spacing w:val="5"/>
           <w:kern w:val="28"/>
           <w:sz w:val="28"/>
@@ -912,7 +929,7 @@
           <w:rFonts w:asciiTheme="majorHAnsi" w:eastAsiaTheme="majorEastAsia" w:hAnsiTheme="majorHAnsi" w:cstheme="majorBidi"/>
           <w:b/>
           <w:bCs/>
-          <w:color w:val="17365D" w:themeColor="text2" w:themeShade="BF"/>
+          <w:color w:val="000000" w:themeColor="text1"/>
           <w:spacing w:val="5"/>
           <w:kern w:val="28"/>
           <w:sz w:val="28"/>
@@ -932,7 +949,7 @@
           <w:rFonts w:asciiTheme="majorHAnsi" w:eastAsiaTheme="majorEastAsia" w:hAnsiTheme="majorHAnsi" w:cstheme="majorBidi"/>
           <w:b/>
           <w:bCs/>
-          <w:color w:val="17365D" w:themeColor="text2" w:themeShade="BF"/>
+          <w:color w:val="000000" w:themeColor="text1"/>
           <w:spacing w:val="5"/>
           <w:kern w:val="28"/>
           <w:sz w:val="28"/>
@@ -945,7 +962,7 @@
           <w:rFonts w:asciiTheme="majorHAnsi" w:eastAsiaTheme="majorEastAsia" w:hAnsiTheme="majorHAnsi" w:cstheme="majorBidi"/>
           <w:b/>
           <w:bCs/>
-          <w:color w:val="17365D" w:themeColor="text2" w:themeShade="BF"/>
+          <w:color w:val="000000" w:themeColor="text1"/>
           <w:spacing w:val="5"/>
           <w:kern w:val="28"/>
           <w:sz w:val="28"/>
@@ -965,7 +982,7 @@
           <w:rFonts w:asciiTheme="majorHAnsi" w:eastAsiaTheme="majorEastAsia" w:hAnsiTheme="majorHAnsi" w:cstheme="majorBidi"/>
           <w:b/>
           <w:bCs/>
-          <w:color w:val="17365D" w:themeColor="text2" w:themeShade="BF"/>
+          <w:color w:val="000000" w:themeColor="text1"/>
           <w:spacing w:val="5"/>
           <w:kern w:val="28"/>
           <w:sz w:val="28"/>
@@ -978,7 +995,7 @@
           <w:rFonts w:asciiTheme="majorHAnsi" w:eastAsiaTheme="majorEastAsia" w:hAnsiTheme="majorHAnsi" w:cstheme="majorBidi"/>
           <w:b/>
           <w:bCs/>
-          <w:color w:val="17365D" w:themeColor="text2" w:themeShade="BF"/>
+          <w:color w:val="000000" w:themeColor="text1"/>
           <w:spacing w:val="5"/>
           <w:kern w:val="28"/>
           <w:sz w:val="28"/>
@@ -994,7 +1011,7 @@
           <w:rFonts w:asciiTheme="majorHAnsi" w:eastAsiaTheme="majorEastAsia" w:hAnsiTheme="majorHAnsi" w:cstheme="majorBidi"/>
           <w:b/>
           <w:bCs/>
-          <w:color w:val="17365D" w:themeColor="text2" w:themeShade="BF"/>
+          <w:color w:val="000000" w:themeColor="text1"/>
           <w:spacing w:val="5"/>
           <w:kern w:val="28"/>
           <w:sz w:val="28"/>
@@ -1007,7 +1024,7 @@
           <w:rFonts w:asciiTheme="majorHAnsi" w:eastAsiaTheme="majorEastAsia" w:hAnsiTheme="majorHAnsi" w:cstheme="majorBidi"/>
           <w:b/>
           <w:bCs/>
-          <w:color w:val="17365D" w:themeColor="text2" w:themeShade="BF"/>
+          <w:color w:val="000000" w:themeColor="text1"/>
           <w:spacing w:val="5"/>
           <w:kern w:val="28"/>
           <w:sz w:val="28"/>
@@ -1025,7 +1042,7 @@
           <w:rFonts w:asciiTheme="majorHAnsi" w:eastAsiaTheme="majorEastAsia" w:hAnsiTheme="majorHAnsi" w:cstheme="majorBidi"/>
           <w:b/>
           <w:bCs/>
-          <w:color w:val="17365D" w:themeColor="text2" w:themeShade="BF"/>
+          <w:color w:val="1F497D" w:themeColor="text2"/>
           <w:spacing w:val="5"/>
           <w:kern w:val="28"/>
           <w:sz w:val="28"/>
@@ -1038,7 +1055,7 @@
           <w:rFonts w:asciiTheme="majorHAnsi" w:eastAsiaTheme="majorEastAsia" w:hAnsiTheme="majorHAnsi" w:cstheme="majorBidi"/>
           <w:b/>
           <w:bCs/>
-          <w:color w:val="17365D" w:themeColor="text2" w:themeShade="BF"/>
+          <w:color w:val="1F497D" w:themeColor="text2"/>
           <w:spacing w:val="5"/>
           <w:kern w:val="28"/>
           <w:sz w:val="28"/>
@@ -1054,7 +1071,7 @@
           <w:rFonts w:asciiTheme="majorHAnsi" w:eastAsiaTheme="majorEastAsia" w:hAnsiTheme="majorHAnsi" w:cstheme="majorBidi"/>
           <w:b/>
           <w:bCs/>
-          <w:color w:val="17365D" w:themeColor="text2" w:themeShade="BF"/>
+          <w:color w:val="000000" w:themeColor="text1"/>
           <w:spacing w:val="5"/>
           <w:kern w:val="28"/>
           <w:sz w:val="28"/>
@@ -1067,7 +1084,7 @@
           <w:rFonts w:asciiTheme="majorHAnsi" w:eastAsiaTheme="majorEastAsia" w:hAnsiTheme="majorHAnsi" w:cstheme="majorBidi"/>
           <w:b/>
           <w:bCs/>
-          <w:color w:val="17365D" w:themeColor="text2" w:themeShade="BF"/>
+          <w:color w:val="000000" w:themeColor="text1"/>
           <w:spacing w:val="5"/>
           <w:kern w:val="28"/>
           <w:sz w:val="28"/>
@@ -1081,7 +1098,7 @@
           <w:rFonts w:asciiTheme="majorHAnsi" w:eastAsiaTheme="majorEastAsia" w:hAnsiTheme="majorHAnsi" w:cstheme="majorBidi"/>
           <w:b/>
           <w:bCs/>
-          <w:color w:val="17365D" w:themeColor="text2" w:themeShade="BF"/>
+          <w:color w:val="000000" w:themeColor="text1"/>
           <w:spacing w:val="5"/>
           <w:kern w:val="28"/>
           <w:sz w:val="28"/>
@@ -1098,7 +1115,7 @@
           <w:rFonts w:asciiTheme="majorHAnsi" w:eastAsiaTheme="majorEastAsia" w:hAnsiTheme="majorHAnsi" w:cstheme="majorBidi"/>
           <w:b/>
           <w:bCs/>
-          <w:color w:val="17365D" w:themeColor="text2" w:themeShade="BF"/>
+          <w:color w:val="000000" w:themeColor="text1"/>
           <w:spacing w:val="5"/>
           <w:kern w:val="28"/>
           <w:sz w:val="28"/>
@@ -1111,13 +1128,14 @@
           <w:rFonts w:asciiTheme="majorHAnsi" w:eastAsiaTheme="majorEastAsia" w:hAnsiTheme="majorHAnsi" w:cstheme="majorBidi"/>
           <w:b/>
           <w:bCs/>
-          <w:color w:val="17365D" w:themeColor="text2" w:themeShade="BF"/>
+          <w:color w:val="000000" w:themeColor="text1"/>
           <w:spacing w:val="5"/>
           <w:kern w:val="28"/>
           <w:sz w:val="28"/>
           <w:szCs w:val="28"/>
           <w:lang w:val="es-MX"/>
         </w:rPr>
+        <w:lastRenderedPageBreak/>
         <w:t>Técnico Profesional en Operaciones Turísticas – Universidad Católica de Manizales</w:t>
       </w:r>
       <w:r>
@@ -1125,7 +1143,7 @@
           <w:rFonts w:asciiTheme="majorHAnsi" w:eastAsiaTheme="majorEastAsia" w:hAnsiTheme="majorHAnsi" w:cstheme="majorBidi"/>
           <w:b/>
           <w:bCs/>
-          <w:color w:val="17365D" w:themeColor="text2" w:themeShade="BF"/>
+          <w:color w:val="000000" w:themeColor="text1"/>
           <w:spacing w:val="5"/>
           <w:kern w:val="28"/>
           <w:sz w:val="28"/>
@@ -1142,7 +1160,7 @@
           <w:rFonts w:asciiTheme="majorHAnsi" w:eastAsiaTheme="majorEastAsia" w:hAnsiTheme="majorHAnsi" w:cstheme="majorBidi"/>
           <w:b/>
           <w:bCs/>
-          <w:color w:val="17365D" w:themeColor="text2" w:themeShade="BF"/>
+          <w:color w:val="000000" w:themeColor="text1"/>
           <w:spacing w:val="5"/>
           <w:kern w:val="28"/>
           <w:sz w:val="28"/>
@@ -1155,14 +1173,13 @@
           <w:rFonts w:asciiTheme="majorHAnsi" w:eastAsiaTheme="majorEastAsia" w:hAnsiTheme="majorHAnsi" w:cstheme="majorBidi"/>
           <w:b/>
           <w:bCs/>
-          <w:color w:val="17365D" w:themeColor="text2" w:themeShade="BF"/>
+          <w:color w:val="000000" w:themeColor="text1"/>
           <w:spacing w:val="5"/>
           <w:kern w:val="28"/>
           <w:sz w:val="28"/>
           <w:szCs w:val="28"/>
           <w:lang w:val="es-MX"/>
         </w:rPr>
-        <w:lastRenderedPageBreak/>
         <w:t>Bachiller Académico – Institución Educativa Rural María Goretti</w:t>
       </w:r>
       <w:r>
@@ -1170,7 +1187,7 @@
           <w:rFonts w:asciiTheme="majorHAnsi" w:eastAsiaTheme="majorEastAsia" w:hAnsiTheme="majorHAnsi" w:cstheme="majorBidi"/>
           <w:b/>
           <w:bCs/>
-          <w:color w:val="17365D" w:themeColor="text2" w:themeShade="BF"/>
+          <w:color w:val="000000" w:themeColor="text1"/>
           <w:spacing w:val="5"/>
           <w:kern w:val="28"/>
           <w:sz w:val="28"/>
@@ -1187,7 +1204,7 @@
           <w:rFonts w:asciiTheme="majorHAnsi" w:eastAsiaTheme="majorEastAsia" w:hAnsiTheme="majorHAnsi" w:cstheme="majorBidi"/>
           <w:b/>
           <w:bCs/>
-          <w:color w:val="17365D" w:themeColor="text2" w:themeShade="BF"/>
+          <w:color w:val="000000" w:themeColor="text1"/>
           <w:spacing w:val="5"/>
           <w:kern w:val="28"/>
           <w:sz w:val="28"/>
@@ -1200,7 +1217,7 @@
           <w:rFonts w:asciiTheme="majorHAnsi" w:eastAsiaTheme="majorEastAsia" w:hAnsiTheme="majorHAnsi" w:cstheme="majorBidi"/>
           <w:b/>
           <w:bCs/>
-          <w:color w:val="17365D" w:themeColor="text2" w:themeShade="BF"/>
+          <w:color w:val="000000" w:themeColor="text1"/>
           <w:spacing w:val="5"/>
           <w:kern w:val="28"/>
           <w:sz w:val="28"/>
@@ -1218,7 +1235,7 @@
           <w:rFonts w:asciiTheme="majorHAnsi" w:eastAsiaTheme="majorEastAsia" w:hAnsiTheme="majorHAnsi" w:cstheme="majorBidi"/>
           <w:b/>
           <w:bCs/>
-          <w:color w:val="17365D" w:themeColor="text2" w:themeShade="BF"/>
+          <w:color w:val="1F497D" w:themeColor="text2"/>
           <w:spacing w:val="5"/>
           <w:kern w:val="28"/>
           <w:sz w:val="28"/>
@@ -1231,7 +1248,7 @@
           <w:rFonts w:asciiTheme="majorHAnsi" w:eastAsiaTheme="majorEastAsia" w:hAnsiTheme="majorHAnsi" w:cstheme="majorBidi"/>
           <w:b/>
           <w:bCs/>
-          <w:color w:val="17365D" w:themeColor="text2" w:themeShade="BF"/>
+          <w:color w:val="1F497D" w:themeColor="text2"/>
           <w:spacing w:val="5"/>
           <w:kern w:val="28"/>
           <w:sz w:val="28"/>
@@ -1247,7 +1264,7 @@
           <w:rFonts w:asciiTheme="majorHAnsi" w:eastAsiaTheme="majorEastAsia" w:hAnsiTheme="majorHAnsi" w:cstheme="majorBidi"/>
           <w:b/>
           <w:bCs/>
-          <w:color w:val="17365D" w:themeColor="text2" w:themeShade="BF"/>
+          <w:color w:val="000000" w:themeColor="text1"/>
           <w:spacing w:val="5"/>
           <w:kern w:val="28"/>
           <w:sz w:val="28"/>
@@ -1261,7 +1278,7 @@
           <w:rFonts w:asciiTheme="majorHAnsi" w:eastAsiaTheme="majorEastAsia" w:hAnsiTheme="majorHAnsi" w:cstheme="majorBidi"/>
           <w:b/>
           <w:bCs/>
-          <w:color w:val="17365D" w:themeColor="text2" w:themeShade="BF"/>
+          <w:color w:val="000000" w:themeColor="text1"/>
           <w:spacing w:val="5"/>
           <w:kern w:val="28"/>
           <w:sz w:val="28"/>
@@ -1276,7 +1293,7 @@
           <w:rFonts w:asciiTheme="majorHAnsi" w:eastAsiaTheme="majorEastAsia" w:hAnsiTheme="majorHAnsi" w:cstheme="majorBidi"/>
           <w:b/>
           <w:bCs/>
-          <w:color w:val="17365D" w:themeColor="text2" w:themeShade="BF"/>
+          <w:color w:val="000000" w:themeColor="text1"/>
           <w:spacing w:val="5"/>
           <w:kern w:val="28"/>
           <w:sz w:val="28"/>
@@ -1290,7 +1307,7 @@
           <w:rFonts w:asciiTheme="majorHAnsi" w:eastAsiaTheme="majorEastAsia" w:hAnsiTheme="majorHAnsi" w:cstheme="majorBidi"/>
           <w:b/>
           <w:bCs/>
-          <w:color w:val="17365D" w:themeColor="text2" w:themeShade="BF"/>
+          <w:color w:val="000000" w:themeColor="text1"/>
           <w:spacing w:val="5"/>
           <w:kern w:val="28"/>
           <w:sz w:val="28"/>
@@ -1307,7 +1324,7 @@
           <w:rFonts w:asciiTheme="majorHAnsi" w:eastAsiaTheme="majorEastAsia" w:hAnsiTheme="majorHAnsi" w:cstheme="majorBidi"/>
           <w:b/>
           <w:bCs/>
-          <w:color w:val="17365D" w:themeColor="text2" w:themeShade="BF"/>
+          <w:color w:val="000000" w:themeColor="text1"/>
           <w:spacing w:val="5"/>
           <w:kern w:val="28"/>
           <w:sz w:val="28"/>
@@ -1320,7 +1337,7 @@
           <w:rFonts w:asciiTheme="majorHAnsi" w:eastAsiaTheme="majorEastAsia" w:hAnsiTheme="majorHAnsi" w:cstheme="majorBidi"/>
           <w:b/>
           <w:bCs/>
-          <w:color w:val="17365D" w:themeColor="text2" w:themeShade="BF"/>
+          <w:color w:val="000000" w:themeColor="text1"/>
           <w:spacing w:val="5"/>
           <w:kern w:val="28"/>
           <w:sz w:val="28"/>
@@ -1338,7 +1355,7 @@
           <w:rFonts w:asciiTheme="majorHAnsi" w:eastAsiaTheme="majorEastAsia" w:hAnsiTheme="majorHAnsi" w:cstheme="majorBidi"/>
           <w:b/>
           <w:bCs/>
-          <w:color w:val="17365D" w:themeColor="text2" w:themeShade="BF"/>
+          <w:color w:val="1F497D" w:themeColor="text2"/>
           <w:spacing w:val="5"/>
           <w:kern w:val="28"/>
           <w:sz w:val="28"/>
@@ -1351,7 +1368,7 @@
           <w:rFonts w:asciiTheme="majorHAnsi" w:eastAsiaTheme="majorEastAsia" w:hAnsiTheme="majorHAnsi" w:cstheme="majorBidi"/>
           <w:b/>
           <w:bCs/>
-          <w:color w:val="17365D" w:themeColor="text2" w:themeShade="BF"/>
+          <w:color w:val="1F497D" w:themeColor="text2"/>
           <w:spacing w:val="5"/>
           <w:kern w:val="28"/>
           <w:sz w:val="28"/>
@@ -1367,7 +1384,7 @@
           <w:rFonts w:asciiTheme="majorHAnsi" w:eastAsiaTheme="majorEastAsia" w:hAnsiTheme="majorHAnsi" w:cstheme="majorBidi"/>
           <w:b/>
           <w:bCs/>
-          <w:color w:val="17365D" w:themeColor="text2" w:themeShade="BF"/>
+          <w:color w:val="000000" w:themeColor="text1"/>
           <w:spacing w:val="5"/>
           <w:kern w:val="28"/>
           <w:sz w:val="28"/>
@@ -1380,7 +1397,7 @@
           <w:rFonts w:asciiTheme="majorHAnsi" w:eastAsiaTheme="majorEastAsia" w:hAnsiTheme="majorHAnsi" w:cstheme="majorBidi"/>
           <w:b/>
           <w:bCs/>
-          <w:color w:val="17365D" w:themeColor="text2" w:themeShade="BF"/>
+          <w:color w:val="000000" w:themeColor="text1"/>
           <w:spacing w:val="5"/>
           <w:kern w:val="28"/>
           <w:sz w:val="28"/>
@@ -1394,7 +1411,7 @@
           <w:rFonts w:asciiTheme="majorHAnsi" w:eastAsiaTheme="majorEastAsia" w:hAnsiTheme="majorHAnsi" w:cstheme="majorBidi"/>
           <w:b/>
           <w:bCs/>
-          <w:color w:val="17365D" w:themeColor="text2" w:themeShade="BF"/>
+          <w:color w:val="000000" w:themeColor="text1"/>
           <w:spacing w:val="5"/>
           <w:kern w:val="28"/>
           <w:sz w:val="28"/>
@@ -1409,7 +1426,7 @@
           <w:rFonts w:asciiTheme="majorHAnsi" w:eastAsiaTheme="majorEastAsia" w:hAnsiTheme="majorHAnsi" w:cstheme="majorBidi"/>
           <w:b/>
           <w:bCs/>
-          <w:color w:val="17365D" w:themeColor="text2" w:themeShade="BF"/>
+          <w:color w:val="000000" w:themeColor="text1"/>
           <w:spacing w:val="5"/>
           <w:kern w:val="28"/>
           <w:sz w:val="28"/>
@@ -1424,7 +1441,7 @@
           <w:rFonts w:asciiTheme="majorHAnsi" w:eastAsiaTheme="majorEastAsia" w:hAnsiTheme="majorHAnsi" w:cstheme="majorBidi"/>
           <w:b/>
           <w:bCs/>
-          <w:color w:val="17365D" w:themeColor="text2" w:themeShade="BF"/>
+          <w:color w:val="000000" w:themeColor="text1"/>
           <w:spacing w:val="5"/>
           <w:kern w:val="28"/>
           <w:sz w:val="28"/>

</xml_diff>

<commit_message>
Actualiza index y CV adjunto
</commit_message>
<xml_diff>
--- a/assets/CV_Juan_Cardona.docx
+++ b/assets/CV_Juan_Cardona.docx
@@ -74,6 +74,22 @@
         </w:rPr>
         <w:br/>
       </w:r>
+      <w:hyperlink r:id="rId6" w:history="1">
+        <w:r>
+          <w:rPr>
+            <w:rStyle w:val="Hyperlink"/>
+            <w:rFonts w:asciiTheme="majorHAnsi" w:eastAsiaTheme="majorEastAsia" w:hAnsiTheme="majorHAnsi" w:cstheme="majorBidi"/>
+            <w:b/>
+            <w:bCs/>
+            <w:spacing w:val="5"/>
+            <w:kern w:val="28"/>
+            <w:sz w:val="28"/>
+            <w:szCs w:val="28"/>
+            <w:lang w:val="es-MX"/>
+          </w:rPr>
+          <w:t>thisisgabriel05@hotmail.com</w:t>
+        </w:r>
+      </w:hyperlink>
       <w:r>
         <w:rPr>
           <w:rFonts w:asciiTheme="majorHAnsi" w:eastAsiaTheme="majorEastAsia" w:hAnsiTheme="majorHAnsi" w:cstheme="majorBidi"/>
@@ -86,7 +102,7 @@
           <w:szCs w:val="28"/>
           <w:lang w:val="es-MX"/>
         </w:rPr>
-        <w:t>thisisgabriel05@hotmail.com</w:t>
+        <w:t xml:space="preserve"> | </w:t>
       </w:r>
       <w:r>
         <w:rPr>
@@ -100,7 +116,6 @@
           <w:szCs w:val="28"/>
           <w:lang w:val="es-MX"/>
         </w:rPr>
-        <w:br/>
         <w:t>3054304039</w:t>
       </w:r>
       <w:r>
@@ -117,7 +132,7 @@
         </w:rPr>
         <w:br/>
       </w:r>
-      <w:hyperlink r:id="rId6" w:history="1">
+      <w:hyperlink r:id="rId7" w:history="1">
         <w:r>
           <w:rPr>
             <w:rStyle w:val="Hyperlink"/>
@@ -147,7 +162,7 @@
         </w:rPr>
         <w:br/>
       </w:r>
-      <w:hyperlink r:id="rId7" w:history="1">
+      <w:hyperlink r:id="rId8" w:history="1">
         <w:r>
           <w:rPr>
             <w:rStyle w:val="Hyperlink"/>
@@ -252,21 +267,6 @@
         </w:rPr>
         <w:t>Estudiante de octavo semestre de Ingeniería en Informática con formación en desarrollo de software, estructuras de datos y desarrollo web. Experiencia en la creación de proyectos académicos y personales enfocados en la solución de problemas mediante tecnología.</w:t>
       </w:r>
-    </w:p>
-    <w:p>
-      <w:pPr>
-        <w:rPr>
-          <w:rFonts w:asciiTheme="majorHAnsi" w:eastAsiaTheme="majorEastAsia" w:hAnsiTheme="majorHAnsi" w:cstheme="majorBidi"/>
-          <w:b/>
-          <w:bCs/>
-          <w:color w:val="000000" w:themeColor="text1"/>
-          <w:spacing w:val="5"/>
-          <w:kern w:val="28"/>
-          <w:sz w:val="28"/>
-          <w:szCs w:val="28"/>
-          <w:lang w:val="es-MX"/>
-        </w:rPr>
-      </w:pPr>
       <w:r>
         <w:rPr>
           <w:rFonts w:asciiTheme="majorHAnsi" w:eastAsiaTheme="majorEastAsia" w:hAnsiTheme="majorHAnsi" w:cstheme="majorBidi"/>
@@ -279,9 +279,8 @@
           <w:szCs w:val="28"/>
           <w:lang w:val="es-MX"/>
         </w:rPr>
-        <w:t xml:space="preserve">Cuento con conocimientos en Python, JavaScript y Java, así como en herramientas de desarrollo, control de versiones, entornos </w:t>
+        <w:t xml:space="preserve"> </w:t>
       </w:r>
-      <w:proofErr w:type="spellStart"/>
       <w:r>
         <w:rPr>
           <w:rFonts w:asciiTheme="majorHAnsi" w:eastAsiaTheme="majorEastAsia" w:hAnsiTheme="majorHAnsi" w:cstheme="majorBidi"/>
@@ -294,9 +293,8 @@
           <w:szCs w:val="28"/>
           <w:lang w:val="es-MX"/>
         </w:rPr>
-        <w:t>cloud</w:t>
+        <w:t>Me caracterizo por el aprendizaje autónomo, pensamiento lógico y orientación a resultados, con interés en iniciar mi carrera profesional</w:t>
       </w:r>
-      <w:proofErr w:type="spellEnd"/>
       <w:r>
         <w:rPr>
           <w:rFonts w:asciiTheme="majorHAnsi" w:eastAsiaTheme="majorEastAsia" w:hAnsiTheme="majorHAnsi" w:cstheme="majorBidi"/>
@@ -309,37 +307,7 @@
           <w:szCs w:val="28"/>
           <w:lang w:val="es-MX"/>
         </w:rPr>
-        <w:t xml:space="preserve"> y fundamentos de análisis de datos. Me caracterizo por el aprendizaje autónomo, pensamiento lógico y orientación a resultados, con interés en iniciar mi carrera profesional en áreas de desarrollo, soporte tecnológico, pruebas de software (QA) o </w:t>
-      </w:r>
-      <w:proofErr w:type="gramStart"/>
-      <w:r>
-        <w:rPr>
-          <w:rFonts w:asciiTheme="majorHAnsi" w:eastAsiaTheme="majorEastAsia" w:hAnsiTheme="majorHAnsi" w:cstheme="majorBidi"/>
-          <w:b/>
-          <w:bCs/>
-          <w:color w:val="000000" w:themeColor="text1"/>
-          <w:spacing w:val="5"/>
-          <w:kern w:val="28"/>
-          <w:sz w:val="28"/>
-          <w:szCs w:val="28"/>
-          <w:lang w:val="es-MX"/>
-        </w:rPr>
-        <w:t>roles junior</w:t>
-      </w:r>
-      <w:proofErr w:type="gramEnd"/>
-      <w:r>
-        <w:rPr>
-          <w:rFonts w:asciiTheme="majorHAnsi" w:eastAsiaTheme="majorEastAsia" w:hAnsiTheme="majorHAnsi" w:cstheme="majorBidi"/>
-          <w:b/>
-          <w:bCs/>
-          <w:color w:val="000000" w:themeColor="text1"/>
-          <w:spacing w:val="5"/>
-          <w:kern w:val="28"/>
-          <w:sz w:val="28"/>
-          <w:szCs w:val="28"/>
-          <w:lang w:val="es-MX"/>
-        </w:rPr>
-        <w:t xml:space="preserve"> relacionados con datos.</w:t>
+        <w:t>.</w:t>
       </w:r>
     </w:p>
     <w:p>
@@ -404,6 +372,7 @@
     </w:p>
     <w:p>
       <w:pPr>
+        <w:spacing w:after="0"/>
         <w:rPr>
           <w:rFonts w:asciiTheme="majorHAnsi" w:eastAsiaTheme="majorEastAsia" w:hAnsiTheme="majorHAnsi" w:cstheme="majorBidi"/>
           <w:b/>
@@ -457,8 +426,66 @@
           <w:szCs w:val="28"/>
           <w:lang w:val="es-MX"/>
         </w:rPr>
+        <w:t xml:space="preserve"> y </w:t>
+      </w:r>
+      <w:r>
+        <w:rPr>
+          <w:rFonts w:asciiTheme="majorHAnsi" w:eastAsiaTheme="majorEastAsia" w:hAnsiTheme="majorHAnsi" w:cstheme="majorBidi"/>
+          <w:b/>
+          <w:bCs/>
+          <w:color w:val="000000" w:themeColor="text1"/>
+          <w:spacing w:val="5"/>
+          <w:kern w:val="28"/>
+          <w:sz w:val="28"/>
+          <w:szCs w:val="28"/>
+          <w:lang w:val="es-MX"/>
+        </w:rPr>
+        <w:t xml:space="preserve">consumo de </w:t>
+      </w:r>
+      <w:proofErr w:type="spellStart"/>
+      <w:r>
+        <w:rPr>
+          <w:rFonts w:asciiTheme="majorHAnsi" w:eastAsiaTheme="majorEastAsia" w:hAnsiTheme="majorHAnsi" w:cstheme="majorBidi"/>
+          <w:b/>
+          <w:bCs/>
+          <w:color w:val="000000" w:themeColor="text1"/>
+          <w:spacing w:val="5"/>
+          <w:kern w:val="28"/>
+          <w:sz w:val="28"/>
+          <w:szCs w:val="28"/>
+          <w:lang w:val="es-MX"/>
+        </w:rPr>
+        <w:t>APIs</w:t>
+      </w:r>
+      <w:proofErr w:type="spellEnd"/>
+      <w:r>
+        <w:rPr>
+          <w:rFonts w:asciiTheme="majorHAnsi" w:eastAsiaTheme="majorEastAsia" w:hAnsiTheme="majorHAnsi" w:cstheme="majorBidi"/>
+          <w:b/>
+          <w:bCs/>
+          <w:color w:val="000000" w:themeColor="text1"/>
+          <w:spacing w:val="5"/>
+          <w:kern w:val="28"/>
+          <w:sz w:val="28"/>
+          <w:szCs w:val="28"/>
+          <w:lang w:val="es-MX"/>
+        </w:rPr>
         <w:br/>
-        <w:t>Bases de datos: MySQL, PostgreSQL (consultas SQL y diseño básico)</w:t>
+        <w:t>Bases de datos:</w:t>
+      </w:r>
+      <w:r>
+        <w:rPr>
+          <w:rFonts w:asciiTheme="majorHAnsi" w:eastAsiaTheme="majorEastAsia" w:hAnsiTheme="majorHAnsi" w:cstheme="majorBidi"/>
+          <w:b/>
+          <w:bCs/>
+          <w:color w:val="000000" w:themeColor="text1"/>
+          <w:spacing w:val="5"/>
+          <w:kern w:val="28"/>
+          <w:sz w:val="28"/>
+          <w:szCs w:val="28"/>
+          <w:lang w:val="es-MX"/>
+        </w:rPr>
+        <w:t xml:space="preserve"> SQL</w:t>
       </w:r>
       <w:r>
         <w:rPr>
@@ -473,7 +500,6 @@
           <w:lang w:val="es-MX"/>
         </w:rPr>
         <w:br/>
-        <w:t>Cloud y sistemas: Microsoft Azure (máquinas virtuales, configuración básica), AWS (conceptos básicos)</w:t>
       </w:r>
       <w:r>
         <w:rPr>
@@ -487,8 +513,65 @@
           <w:szCs w:val="28"/>
           <w:lang w:val="es-MX"/>
         </w:rPr>
-        <w:br/>
-        <w:t xml:space="preserve">Herramientas: Git, GitHub, Visual Studio Code, </w:t>
+        <w:t>Configuración de servicios web (</w:t>
+      </w:r>
+      <w:r>
+        <w:rPr>
+          <w:rFonts w:asciiTheme="majorHAnsi" w:eastAsiaTheme="majorEastAsia" w:hAnsiTheme="majorHAnsi" w:cstheme="majorBidi"/>
+          <w:b/>
+          <w:bCs/>
+          <w:color w:val="000000" w:themeColor="text1"/>
+          <w:spacing w:val="5"/>
+          <w:kern w:val="28"/>
+          <w:sz w:val="28"/>
+          <w:szCs w:val="28"/>
+          <w:lang w:val="es-MX"/>
+        </w:rPr>
+        <w:t>Microsoft Azure</w:t>
+      </w:r>
+      <w:r>
+        <w:rPr>
+          <w:rFonts w:asciiTheme="majorHAnsi" w:eastAsiaTheme="majorEastAsia" w:hAnsiTheme="majorHAnsi" w:cstheme="majorBidi"/>
+          <w:b/>
+          <w:bCs/>
+          <w:color w:val="000000" w:themeColor="text1"/>
+          <w:spacing w:val="5"/>
+          <w:kern w:val="28"/>
+          <w:sz w:val="28"/>
+          <w:szCs w:val="28"/>
+          <w:lang w:val="es-MX"/>
+        </w:rPr>
+        <w:t>, AWS)</w:t>
+      </w:r>
+    </w:p>
+    <w:p>
+      <w:pPr>
+        <w:spacing w:after="0"/>
+        <w:rPr>
+          <w:rFonts w:asciiTheme="majorHAnsi" w:eastAsiaTheme="majorEastAsia" w:hAnsiTheme="majorHAnsi" w:cstheme="majorBidi"/>
+          <w:b/>
+          <w:bCs/>
+          <w:color w:val="000000" w:themeColor="text1"/>
+          <w:spacing w:val="5"/>
+          <w:kern w:val="28"/>
+          <w:sz w:val="28"/>
+          <w:szCs w:val="28"/>
+          <w:lang w:val="es-MX"/>
+        </w:rPr>
+      </w:pPr>
+      <w:r>
+        <w:rPr>
+          <w:rFonts w:asciiTheme="majorHAnsi" w:eastAsiaTheme="majorEastAsia" w:hAnsiTheme="majorHAnsi" w:cstheme="majorBidi"/>
+          <w:b/>
+          <w:bCs/>
+          <w:color w:val="000000" w:themeColor="text1"/>
+          <w:spacing w:val="5"/>
+          <w:kern w:val="28"/>
+          <w:sz w:val="28"/>
+          <w:szCs w:val="28"/>
+          <w:lang w:val="es-MX"/>
+        </w:rPr>
+        <w:t xml:space="preserve">Herramientas: Git, GitHub, </w:t>
       </w:r>
       <w:proofErr w:type="spellStart"/>
       <w:r>
@@ -518,332 +601,7 @@
           <w:szCs w:val="28"/>
           <w:lang w:val="es-MX"/>
         </w:rPr>
-        <w:br/>
-        <w:t xml:space="preserve">Análisis de datos: Excel (funciones, tablas, análisis básico), </w:t>
-      </w:r>
-      <w:proofErr w:type="spellStart"/>
-      <w:r>
-        <w:rPr>
-          <w:rFonts w:asciiTheme="majorHAnsi" w:eastAsiaTheme="majorEastAsia" w:hAnsiTheme="majorHAnsi" w:cstheme="majorBidi"/>
-          <w:b/>
-          <w:bCs/>
-          <w:color w:val="000000" w:themeColor="text1"/>
-          <w:spacing w:val="5"/>
-          <w:kern w:val="28"/>
-          <w:sz w:val="28"/>
-          <w:szCs w:val="28"/>
-          <w:lang w:val="es-MX"/>
-        </w:rPr>
-        <w:t>Weka</w:t>
-      </w:r>
-      <w:proofErr w:type="spellEnd"/>
-      <w:r>
-        <w:rPr>
-          <w:rFonts w:asciiTheme="majorHAnsi" w:eastAsiaTheme="majorEastAsia" w:hAnsiTheme="majorHAnsi" w:cstheme="majorBidi"/>
-          <w:b/>
-          <w:bCs/>
-          <w:color w:val="000000" w:themeColor="text1"/>
-          <w:spacing w:val="5"/>
-          <w:kern w:val="28"/>
-          <w:sz w:val="28"/>
-          <w:szCs w:val="28"/>
-          <w:lang w:val="es-MX"/>
-        </w:rPr>
-        <w:t xml:space="preserve"> </w:t>
-      </w:r>
-      <w:r>
-        <w:rPr>
-          <w:rFonts w:asciiTheme="majorHAnsi" w:eastAsiaTheme="majorEastAsia" w:hAnsiTheme="majorHAnsi" w:cstheme="majorBidi"/>
-          <w:b/>
-          <w:bCs/>
-          <w:color w:val="000000" w:themeColor="text1"/>
-          <w:spacing w:val="5"/>
-          <w:kern w:val="28"/>
-          <w:sz w:val="28"/>
-          <w:szCs w:val="28"/>
-          <w:lang w:val="es-MX"/>
-        </w:rPr>
-        <w:lastRenderedPageBreak/>
-        <w:t xml:space="preserve">(machine </w:t>
-      </w:r>
-      <w:proofErr w:type="spellStart"/>
-      <w:r>
-        <w:rPr>
-          <w:rFonts w:asciiTheme="majorHAnsi" w:eastAsiaTheme="majorEastAsia" w:hAnsiTheme="majorHAnsi" w:cstheme="majorBidi"/>
-          <w:b/>
-          <w:bCs/>
-          <w:color w:val="000000" w:themeColor="text1"/>
-          <w:spacing w:val="5"/>
-          <w:kern w:val="28"/>
-          <w:sz w:val="28"/>
-          <w:szCs w:val="28"/>
-          <w:lang w:val="es-MX"/>
-        </w:rPr>
-        <w:t>learning</w:t>
-      </w:r>
-      <w:proofErr w:type="spellEnd"/>
-      <w:r>
-        <w:rPr>
-          <w:rFonts w:asciiTheme="majorHAnsi" w:eastAsiaTheme="majorEastAsia" w:hAnsiTheme="majorHAnsi" w:cstheme="majorBidi"/>
-          <w:b/>
-          <w:bCs/>
-          <w:color w:val="000000" w:themeColor="text1"/>
-          <w:spacing w:val="5"/>
-          <w:kern w:val="28"/>
-          <w:sz w:val="28"/>
-          <w:szCs w:val="28"/>
-          <w:lang w:val="es-MX"/>
-        </w:rPr>
-        <w:t xml:space="preserve"> básico)</w:t>
-      </w:r>
-      <w:r>
-        <w:rPr>
-          <w:rFonts w:asciiTheme="majorHAnsi" w:eastAsiaTheme="majorEastAsia" w:hAnsiTheme="majorHAnsi" w:cstheme="majorBidi"/>
-          <w:b/>
-          <w:bCs/>
-          <w:color w:val="000000" w:themeColor="text1"/>
-          <w:spacing w:val="5"/>
-          <w:kern w:val="28"/>
-          <w:sz w:val="28"/>
-          <w:szCs w:val="28"/>
-          <w:lang w:val="es-MX"/>
-        </w:rPr>
-        <w:br/>
-        <w:t>Inteligencia artificial: Fundamentos de redes neuronales</w:t>
-      </w:r>
-      <w:r>
-        <w:rPr>
-          <w:rFonts w:asciiTheme="majorHAnsi" w:eastAsiaTheme="majorEastAsia" w:hAnsiTheme="majorHAnsi" w:cstheme="majorBidi"/>
-          <w:b/>
-          <w:bCs/>
-          <w:color w:val="000000" w:themeColor="text1"/>
-          <w:spacing w:val="5"/>
-          <w:kern w:val="28"/>
-          <w:sz w:val="28"/>
-          <w:szCs w:val="28"/>
-          <w:lang w:val="es-MX"/>
-        </w:rPr>
-        <w:br/>
-        <w:t>Pruebas de software (QA): Diseño de casos de prueba, pruebas funcionales y validación de software</w:t>
-      </w:r>
-      <w:r>
-        <w:rPr>
-          <w:rFonts w:asciiTheme="majorHAnsi" w:eastAsiaTheme="majorEastAsia" w:hAnsiTheme="majorHAnsi" w:cstheme="majorBidi"/>
-          <w:b/>
-          <w:bCs/>
-          <w:color w:val="000000" w:themeColor="text1"/>
-          <w:spacing w:val="5"/>
-          <w:kern w:val="28"/>
-          <w:sz w:val="28"/>
-          <w:szCs w:val="28"/>
-          <w:lang w:val="es-MX"/>
-        </w:rPr>
-        <w:br/>
-        <w:t xml:space="preserve">Conceptos: Programación orientada a objetos, estructuras de datos, lógica de programación, consumo de </w:t>
-      </w:r>
-      <w:proofErr w:type="spellStart"/>
-      <w:r>
-        <w:rPr>
-          <w:rFonts w:asciiTheme="majorHAnsi" w:eastAsiaTheme="majorEastAsia" w:hAnsiTheme="majorHAnsi" w:cstheme="majorBidi"/>
-          <w:b/>
-          <w:bCs/>
-          <w:color w:val="000000" w:themeColor="text1"/>
-          <w:spacing w:val="5"/>
-          <w:kern w:val="28"/>
-          <w:sz w:val="28"/>
-          <w:szCs w:val="28"/>
-          <w:lang w:val="es-MX"/>
-        </w:rPr>
-        <w:t>APIs</w:t>
-      </w:r>
-      <w:proofErr w:type="spellEnd"/>
-    </w:p>
-    <w:p>
-      <w:pPr>
-        <w:rPr>
-          <w:rFonts w:asciiTheme="majorHAnsi" w:eastAsiaTheme="majorEastAsia" w:hAnsiTheme="majorHAnsi" w:cstheme="majorBidi"/>
-          <w:b/>
-          <w:bCs/>
-          <w:color w:val="000000" w:themeColor="text1"/>
-          <w:spacing w:val="5"/>
-          <w:kern w:val="28"/>
-          <w:sz w:val="28"/>
-          <w:szCs w:val="28"/>
-          <w:lang w:val="es-MX"/>
-        </w:rPr>
-      </w:pPr>
-      <w:r>
-        <w:rPr>
-          <w:rFonts w:asciiTheme="majorHAnsi" w:eastAsiaTheme="majorEastAsia" w:hAnsiTheme="majorHAnsi" w:cstheme="majorBidi"/>
-          <w:b/>
-          <w:bCs/>
-          <w:color w:val="000000" w:themeColor="text1"/>
-          <w:spacing w:val="5"/>
-          <w:kern w:val="28"/>
-          <w:sz w:val="28"/>
-          <w:szCs w:val="28"/>
-          <w:lang w:val="es-MX"/>
-        </w:rPr>
-        <w:pict w14:anchorId="188FC2F3">
-          <v:rect id="_x0000_i1027" style="width:0;height:1.5pt" o:hralign="center" o:hrstd="t" o:hr="t" fillcolor="#a0a0a0" stroked="f"/>
-        </w:pict>
-      </w:r>
-    </w:p>
-    <w:p>
-      <w:pPr>
-        <w:rPr>
-          <w:rFonts w:asciiTheme="majorHAnsi" w:eastAsiaTheme="majorEastAsia" w:hAnsiTheme="majorHAnsi" w:cstheme="majorBidi"/>
-          <w:b/>
-          <w:bCs/>
-          <w:color w:val="1F497D" w:themeColor="text2"/>
-          <w:spacing w:val="5"/>
-          <w:kern w:val="28"/>
-          <w:sz w:val="28"/>
-          <w:szCs w:val="28"/>
-          <w:lang w:val="es-MX"/>
-        </w:rPr>
-      </w:pPr>
-      <w:r>
-        <w:rPr>
-          <w:rFonts w:asciiTheme="majorHAnsi" w:eastAsiaTheme="majorEastAsia" w:hAnsiTheme="majorHAnsi" w:cstheme="majorBidi"/>
-          <w:b/>
-          <w:bCs/>
-          <w:color w:val="1F497D" w:themeColor="text2"/>
-          <w:spacing w:val="5"/>
-          <w:kern w:val="28"/>
-          <w:sz w:val="28"/>
-          <w:szCs w:val="28"/>
-          <w:lang w:val="es-MX"/>
-        </w:rPr>
-        <w:t>PROYECTOS ACADÉMICOS Y PERSONALES</w:t>
-      </w:r>
-    </w:p>
-    <w:p>
-      <w:pPr>
-        <w:rPr>
-          <w:rFonts w:asciiTheme="majorHAnsi" w:eastAsiaTheme="majorEastAsia" w:hAnsiTheme="majorHAnsi" w:cstheme="majorBidi"/>
-          <w:b/>
-          <w:bCs/>
-          <w:color w:val="000000" w:themeColor="text1"/>
-          <w:spacing w:val="5"/>
-          <w:kern w:val="28"/>
-          <w:sz w:val="28"/>
-          <w:szCs w:val="28"/>
-          <w:lang w:val="es-MX"/>
-        </w:rPr>
-      </w:pPr>
-      <w:r>
-        <w:rPr>
-          <w:rFonts w:asciiTheme="majorHAnsi" w:eastAsiaTheme="majorEastAsia" w:hAnsiTheme="majorHAnsi" w:cstheme="majorBidi"/>
-          <w:b/>
-          <w:bCs/>
-          <w:color w:val="000000" w:themeColor="text1"/>
-          <w:spacing w:val="5"/>
-          <w:kern w:val="28"/>
-          <w:sz w:val="28"/>
-          <w:szCs w:val="28"/>
-          <w:lang w:val="es-MX"/>
-        </w:rPr>
-        <w:t>Desarrollador de proyectos web | 2023 – Actualidad</w:t>
-      </w:r>
-    </w:p>
-    <w:p>
-      <w:pPr>
-        <w:numPr>
-          <w:ilvl w:val="0"/>
-          <w:numId w:val="13"/>
-        </w:numPr>
-        <w:rPr>
-          <w:rFonts w:asciiTheme="majorHAnsi" w:eastAsiaTheme="majorEastAsia" w:hAnsiTheme="majorHAnsi" w:cstheme="majorBidi"/>
-          <w:b/>
-          <w:bCs/>
-          <w:color w:val="000000" w:themeColor="text1"/>
-          <w:spacing w:val="5"/>
-          <w:kern w:val="28"/>
-          <w:sz w:val="28"/>
-          <w:szCs w:val="28"/>
-          <w:lang w:val="es-MX"/>
-        </w:rPr>
-      </w:pPr>
-      <w:r>
-        <w:rPr>
-          <w:rFonts w:asciiTheme="majorHAnsi" w:eastAsiaTheme="majorEastAsia" w:hAnsiTheme="majorHAnsi" w:cstheme="majorBidi"/>
-          <w:b/>
-          <w:bCs/>
-          <w:color w:val="000000" w:themeColor="text1"/>
-          <w:spacing w:val="5"/>
-          <w:kern w:val="28"/>
-          <w:sz w:val="28"/>
-          <w:szCs w:val="28"/>
-          <w:lang w:val="es-MX"/>
-        </w:rPr>
-        <w:t>Desarrollo de aplicaciones web utilizando HTML, CSS y JavaScript.</w:t>
-      </w:r>
-    </w:p>
-    <w:p>
-      <w:pPr>
-        <w:numPr>
-          <w:ilvl w:val="0"/>
-          <w:numId w:val="13"/>
-        </w:numPr>
-        <w:rPr>
-          <w:rFonts w:asciiTheme="majorHAnsi" w:eastAsiaTheme="majorEastAsia" w:hAnsiTheme="majorHAnsi" w:cstheme="majorBidi"/>
-          <w:b/>
-          <w:bCs/>
-          <w:color w:val="000000" w:themeColor="text1"/>
-          <w:spacing w:val="5"/>
-          <w:kern w:val="28"/>
-          <w:sz w:val="28"/>
-          <w:szCs w:val="28"/>
-          <w:lang w:val="es-MX"/>
-        </w:rPr>
-      </w:pPr>
-      <w:r>
-        <w:rPr>
-          <w:rFonts w:asciiTheme="majorHAnsi" w:eastAsiaTheme="majorEastAsia" w:hAnsiTheme="majorHAnsi" w:cstheme="majorBidi"/>
-          <w:b/>
-          <w:bCs/>
-          <w:color w:val="000000" w:themeColor="text1"/>
-          <w:spacing w:val="5"/>
-          <w:kern w:val="28"/>
-          <w:sz w:val="28"/>
-          <w:szCs w:val="28"/>
-          <w:lang w:val="es-MX"/>
-        </w:rPr>
-        <w:t>Implementación de lógica de negocio basada en estructuras de datos.</w:t>
-      </w:r>
-    </w:p>
-    <w:p>
-      <w:pPr>
-        <w:numPr>
-          <w:ilvl w:val="0"/>
-          <w:numId w:val="13"/>
-        </w:numPr>
-        <w:rPr>
-          <w:rFonts w:asciiTheme="majorHAnsi" w:eastAsiaTheme="majorEastAsia" w:hAnsiTheme="majorHAnsi" w:cstheme="majorBidi"/>
-          <w:b/>
-          <w:bCs/>
-          <w:color w:val="000000" w:themeColor="text1"/>
-          <w:spacing w:val="5"/>
-          <w:kern w:val="28"/>
-          <w:sz w:val="28"/>
-          <w:szCs w:val="28"/>
-          <w:lang w:val="es-MX"/>
-        </w:rPr>
-      </w:pPr>
-      <w:r>
-        <w:rPr>
-          <w:rFonts w:asciiTheme="majorHAnsi" w:eastAsiaTheme="majorEastAsia" w:hAnsiTheme="majorHAnsi" w:cstheme="majorBidi"/>
-          <w:b/>
-          <w:bCs/>
-          <w:color w:val="000000" w:themeColor="text1"/>
-          <w:spacing w:val="5"/>
-          <w:kern w:val="28"/>
-          <w:sz w:val="28"/>
-          <w:szCs w:val="28"/>
-          <w:lang w:val="es-MX"/>
-        </w:rPr>
-        <w:t>Publicación de proyectos en plataformas web (</w:t>
+        <w:t xml:space="preserve"> y </w:t>
       </w:r>
       <w:proofErr w:type="spellStart"/>
       <w:r>
@@ -873,9 +631,9 @@
           <w:szCs w:val="28"/>
           <w:lang w:val="es-MX"/>
         </w:rPr>
-        <w:t xml:space="preserve"> y </w:t>
+        <w:br/>
+        <w:t>Análisis de datos:</w:t>
       </w:r>
-      <w:proofErr w:type="spellStart"/>
       <w:r>
         <w:rPr>
           <w:rFonts w:asciiTheme="majorHAnsi" w:eastAsiaTheme="majorEastAsia" w:hAnsiTheme="majorHAnsi" w:cstheme="majorBidi"/>
@@ -888,9 +646,8 @@
           <w:szCs w:val="28"/>
           <w:lang w:val="es-MX"/>
         </w:rPr>
-        <w:t>Netlify</w:t>
+        <w:t xml:space="preserve"> </w:t>
       </w:r>
-      <w:proofErr w:type="spellEnd"/>
       <w:r>
         <w:rPr>
           <w:rFonts w:asciiTheme="majorHAnsi" w:eastAsiaTheme="majorEastAsia" w:hAnsiTheme="majorHAnsi" w:cstheme="majorBidi"/>
@@ -903,7 +660,142 @@
           <w:szCs w:val="28"/>
           <w:lang w:val="es-MX"/>
         </w:rPr>
-        <w:t>) para acceso y validación funcional.</w:t>
+        <w:t xml:space="preserve">Weka </w:t>
+      </w:r>
+      <w:r>
+        <w:rPr>
+          <w:rFonts w:asciiTheme="majorHAnsi" w:eastAsiaTheme="majorEastAsia" w:hAnsiTheme="majorHAnsi" w:cstheme="majorBidi"/>
+          <w:b/>
+          <w:bCs/>
+          <w:color w:val="000000" w:themeColor="text1"/>
+          <w:spacing w:val="5"/>
+          <w:kern w:val="28"/>
+          <w:sz w:val="28"/>
+          <w:szCs w:val="28"/>
+          <w:lang w:val="es-MX"/>
+        </w:rPr>
+        <w:t>Implementación de lógica de negocio basada en estructuras de datos.</w:t>
+      </w:r>
+      <w:r>
+        <w:rPr>
+          <w:rFonts w:asciiTheme="majorHAnsi" w:eastAsiaTheme="majorEastAsia" w:hAnsiTheme="majorHAnsi" w:cstheme="majorBidi"/>
+          <w:b/>
+          <w:bCs/>
+          <w:color w:val="000000" w:themeColor="text1"/>
+          <w:spacing w:val="5"/>
+          <w:kern w:val="28"/>
+          <w:sz w:val="28"/>
+          <w:szCs w:val="28"/>
+          <w:lang w:val="es-MX"/>
+        </w:rPr>
+        <w:br/>
+        <w:t>Inteligencia artificial: Fundamentos de redes neuronales</w:t>
+      </w:r>
+    </w:p>
+    <w:p>
+      <w:pPr>
+        <w:rPr>
+          <w:rFonts w:asciiTheme="majorHAnsi" w:eastAsiaTheme="majorEastAsia" w:hAnsiTheme="majorHAnsi" w:cstheme="majorBidi"/>
+          <w:b/>
+          <w:bCs/>
+          <w:color w:val="000000" w:themeColor="text1"/>
+          <w:spacing w:val="5"/>
+          <w:kern w:val="28"/>
+          <w:sz w:val="28"/>
+          <w:szCs w:val="28"/>
+          <w:lang w:val="es-MX"/>
+        </w:rPr>
+      </w:pPr>
+      <w:r>
+        <w:rPr>
+          <w:rFonts w:asciiTheme="majorHAnsi" w:eastAsiaTheme="majorEastAsia" w:hAnsiTheme="majorHAnsi" w:cstheme="majorBidi"/>
+          <w:b/>
+          <w:bCs/>
+          <w:color w:val="000000" w:themeColor="text1"/>
+          <w:spacing w:val="5"/>
+          <w:kern w:val="28"/>
+          <w:sz w:val="28"/>
+          <w:szCs w:val="28"/>
+          <w:lang w:val="es-MX"/>
+        </w:rPr>
+        <w:pict w14:anchorId="188FC2F3">
+          <v:rect id="_x0000_i1027" style="width:0;height:1.5pt" o:hralign="center" o:hrstd="t" o:hr="t" fillcolor="#a0a0a0" stroked="f"/>
+        </w:pict>
+      </w:r>
+    </w:p>
+    <w:p>
+      <w:pPr>
+        <w:rPr>
+          <w:rFonts w:asciiTheme="majorHAnsi" w:eastAsiaTheme="majorEastAsia" w:hAnsiTheme="majorHAnsi" w:cstheme="majorBidi"/>
+          <w:b/>
+          <w:bCs/>
+          <w:color w:val="1F497D" w:themeColor="text2"/>
+          <w:spacing w:val="5"/>
+          <w:kern w:val="28"/>
+          <w:sz w:val="28"/>
+          <w:szCs w:val="28"/>
+          <w:lang w:val="es-MX"/>
+        </w:rPr>
+      </w:pPr>
+    </w:p>
+    <w:p>
+      <w:pPr>
+        <w:rPr>
+          <w:rFonts w:asciiTheme="majorHAnsi" w:eastAsiaTheme="majorEastAsia" w:hAnsiTheme="majorHAnsi" w:cstheme="majorBidi"/>
+          <w:b/>
+          <w:bCs/>
+          <w:color w:val="1F497D" w:themeColor="text2"/>
+          <w:spacing w:val="5"/>
+          <w:kern w:val="28"/>
+          <w:sz w:val="28"/>
+          <w:szCs w:val="28"/>
+          <w:lang w:val="es-MX"/>
+        </w:rPr>
+      </w:pPr>
+    </w:p>
+    <w:p>
+      <w:pPr>
+        <w:rPr>
+          <w:rFonts w:asciiTheme="majorHAnsi" w:eastAsiaTheme="majorEastAsia" w:hAnsiTheme="majorHAnsi" w:cstheme="majorBidi"/>
+          <w:b/>
+          <w:bCs/>
+          <w:color w:val="1F497D" w:themeColor="text2"/>
+          <w:spacing w:val="5"/>
+          <w:kern w:val="28"/>
+          <w:sz w:val="28"/>
+          <w:szCs w:val="28"/>
+          <w:lang w:val="es-MX"/>
+        </w:rPr>
+      </w:pPr>
+    </w:p>
+    <w:p>
+      <w:pPr>
+        <w:rPr>
+          <w:rFonts w:asciiTheme="majorHAnsi" w:eastAsiaTheme="majorEastAsia" w:hAnsiTheme="majorHAnsi" w:cstheme="majorBidi"/>
+          <w:b/>
+          <w:bCs/>
+          <w:color w:val="1F497D" w:themeColor="text2"/>
+          <w:spacing w:val="5"/>
+          <w:kern w:val="28"/>
+          <w:sz w:val="28"/>
+          <w:szCs w:val="28"/>
+          <w:lang w:val="es-MX"/>
+        </w:rPr>
+      </w:pPr>
+      <w:r>
+        <w:rPr>
+          <w:rFonts w:asciiTheme="majorHAnsi" w:eastAsiaTheme="majorEastAsia" w:hAnsiTheme="majorHAnsi" w:cstheme="majorBidi"/>
+          <w:b/>
+          <w:bCs/>
+          <w:color w:val="1F497D" w:themeColor="text2"/>
+          <w:spacing w:val="5"/>
+          <w:kern w:val="28"/>
+          <w:sz w:val="28"/>
+          <w:szCs w:val="28"/>
+          <w:lang w:val="es-MX"/>
+        </w:rPr>
+        <w:lastRenderedPageBreak/>
+        <w:t>PROYECTOS ACADÉMICOS Y PERSONALES</w:t>
       </w:r>
     </w:p>
     <w:p>
@@ -936,7 +828,63 @@
           <w:szCs w:val="28"/>
           <w:lang w:val="es-MX"/>
         </w:rPr>
-        <w:t>Uso de GitHub para control de versiones y documentación.</w:t>
+        <w:t xml:space="preserve">Aplicación de pruebas </w:t>
+      </w:r>
+      <w:r>
+        <w:rPr>
+          <w:rFonts w:asciiTheme="majorHAnsi" w:eastAsiaTheme="majorEastAsia" w:hAnsiTheme="majorHAnsi" w:cstheme="majorBidi"/>
+          <w:b/>
+          <w:bCs/>
+          <w:color w:val="000000" w:themeColor="text1"/>
+          <w:spacing w:val="5"/>
+          <w:kern w:val="28"/>
+          <w:sz w:val="28"/>
+          <w:szCs w:val="28"/>
+          <w:lang w:val="es-MX"/>
+        </w:rPr>
+        <w:t>de</w:t>
+      </w:r>
+      <w:r>
+        <w:rPr>
+          <w:rFonts w:asciiTheme="majorHAnsi" w:eastAsiaTheme="majorEastAsia" w:hAnsiTheme="majorHAnsi" w:cstheme="majorBidi"/>
+          <w:b/>
+          <w:bCs/>
+          <w:color w:val="000000" w:themeColor="text1"/>
+          <w:spacing w:val="5"/>
+          <w:kern w:val="28"/>
+          <w:sz w:val="28"/>
+          <w:szCs w:val="28"/>
+          <w:lang w:val="es-MX"/>
+        </w:rPr>
+        <w:t xml:space="preserve"> software (QA)</w:t>
+      </w:r>
+      <w:r>
+        <w:rPr>
+          <w:rFonts w:asciiTheme="majorHAnsi" w:eastAsiaTheme="majorEastAsia" w:hAnsiTheme="majorHAnsi" w:cstheme="majorBidi"/>
+          <w:b/>
+          <w:bCs/>
+          <w:color w:val="000000" w:themeColor="text1"/>
+          <w:spacing w:val="5"/>
+          <w:kern w:val="28"/>
+          <w:sz w:val="28"/>
+          <w:szCs w:val="28"/>
+          <w:lang w:val="es-MX"/>
+        </w:rPr>
+        <w:t xml:space="preserve"> a página web de la empresa Asados Anita</w:t>
+      </w:r>
+      <w:r>
+        <w:rPr>
+          <w:rFonts w:asciiTheme="majorHAnsi" w:eastAsiaTheme="majorEastAsia" w:hAnsiTheme="majorHAnsi" w:cstheme="majorBidi"/>
+          <w:b/>
+          <w:bCs/>
+          <w:color w:val="000000" w:themeColor="text1"/>
+          <w:spacing w:val="5"/>
+          <w:kern w:val="28"/>
+          <w:sz w:val="28"/>
+          <w:szCs w:val="28"/>
+          <w:lang w:val="es-MX"/>
+        </w:rPr>
+        <w:t>, incluyendo diseño de casos de prueba y validación funcional.</w:t>
       </w:r>
     </w:p>
     <w:p>
@@ -969,27 +917,8 @@
           <w:szCs w:val="28"/>
           <w:lang w:val="es-MX"/>
         </w:rPr>
-        <w:t>Participación en pruebas de software (QA), incluyendo diseño de casos de prueba y validación funcional.</w:t>
+        <w:t xml:space="preserve">Desarrollo </w:t>
       </w:r>
-    </w:p>
-    <w:p>
-      <w:pPr>
-        <w:numPr>
-          <w:ilvl w:val="0"/>
-          <w:numId w:val="13"/>
-        </w:numPr>
-        <w:rPr>
-          <w:rFonts w:asciiTheme="majorHAnsi" w:eastAsiaTheme="majorEastAsia" w:hAnsiTheme="majorHAnsi" w:cstheme="majorBidi"/>
-          <w:b/>
-          <w:bCs/>
-          <w:color w:val="000000" w:themeColor="text1"/>
-          <w:spacing w:val="5"/>
-          <w:kern w:val="28"/>
-          <w:sz w:val="28"/>
-          <w:szCs w:val="28"/>
-          <w:lang w:val="es-MX"/>
-        </w:rPr>
-      </w:pPr>
       <w:r>
         <w:rPr>
           <w:rFonts w:asciiTheme="majorHAnsi" w:eastAsiaTheme="majorEastAsia" w:hAnsiTheme="majorHAnsi" w:cstheme="majorBidi"/>
@@ -1002,7 +931,77 @@
           <w:szCs w:val="28"/>
           <w:lang w:val="es-MX"/>
         </w:rPr>
-        <w:t>Desarrollo de soluciones automatizadas con resultados positivos (+157 USD en simulaciones de trading).</w:t>
+        <w:t xml:space="preserve">de </w:t>
+      </w:r>
+      <w:r>
+        <w:rPr>
+          <w:rFonts w:asciiTheme="majorHAnsi" w:eastAsiaTheme="majorEastAsia" w:hAnsiTheme="majorHAnsi" w:cstheme="majorBidi"/>
+          <w:b/>
+          <w:bCs/>
+          <w:color w:val="000000" w:themeColor="text1"/>
+          <w:spacing w:val="5"/>
+          <w:kern w:val="28"/>
+          <w:sz w:val="28"/>
+          <w:szCs w:val="28"/>
+          <w:lang w:val="es-MX"/>
+        </w:rPr>
+        <w:t>scripts</w:t>
+      </w:r>
+      <w:r>
+        <w:rPr>
+          <w:rFonts w:asciiTheme="majorHAnsi" w:eastAsiaTheme="majorEastAsia" w:hAnsiTheme="majorHAnsi" w:cstheme="majorBidi"/>
+          <w:b/>
+          <w:bCs/>
+          <w:color w:val="000000" w:themeColor="text1"/>
+          <w:spacing w:val="5"/>
+          <w:kern w:val="28"/>
+          <w:sz w:val="28"/>
+          <w:szCs w:val="28"/>
+          <w:lang w:val="es-MX"/>
+        </w:rPr>
+        <w:t xml:space="preserve"> </w:t>
+      </w:r>
+      <w:r>
+        <w:rPr>
+          <w:rFonts w:asciiTheme="majorHAnsi" w:eastAsiaTheme="majorEastAsia" w:hAnsiTheme="majorHAnsi" w:cstheme="majorBidi"/>
+          <w:b/>
+          <w:bCs/>
+          <w:color w:val="000000" w:themeColor="text1"/>
+          <w:spacing w:val="5"/>
+          <w:kern w:val="28"/>
+          <w:sz w:val="28"/>
+          <w:szCs w:val="28"/>
+          <w:lang w:val="es-MX"/>
+        </w:rPr>
+        <w:t xml:space="preserve">para automatizar operaciones de trading </w:t>
+      </w:r>
+      <w:r>
+        <w:rPr>
+          <w:rFonts w:asciiTheme="majorHAnsi" w:eastAsiaTheme="majorEastAsia" w:hAnsiTheme="majorHAnsi" w:cstheme="majorBidi"/>
+          <w:b/>
+          <w:bCs/>
+          <w:color w:val="000000" w:themeColor="text1"/>
+          <w:spacing w:val="5"/>
+          <w:kern w:val="28"/>
+          <w:sz w:val="28"/>
+          <w:szCs w:val="28"/>
+          <w:lang w:val="es-MX"/>
+        </w:rPr>
+        <w:t>con resultados positivos</w:t>
+      </w:r>
+      <w:r>
+        <w:rPr>
+          <w:rFonts w:asciiTheme="majorHAnsi" w:eastAsiaTheme="majorEastAsia" w:hAnsiTheme="majorHAnsi" w:cstheme="majorBidi"/>
+          <w:b/>
+          <w:bCs/>
+          <w:color w:val="000000" w:themeColor="text1"/>
+          <w:spacing w:val="5"/>
+          <w:kern w:val="28"/>
+          <w:sz w:val="28"/>
+          <w:szCs w:val="28"/>
+          <w:lang w:val="es-MX"/>
+        </w:rPr>
+        <w:t>.</w:t>
       </w:r>
     </w:p>
     <w:p>
@@ -1067,6 +1066,11 @@
     </w:p>
     <w:p>
       <w:pPr>
+        <w:pStyle w:val="ListParagraph"/>
+        <w:numPr>
+          <w:ilvl w:val="0"/>
+          <w:numId w:val="14"/>
+        </w:numPr>
         <w:rPr>
           <w:rFonts w:asciiTheme="majorHAnsi" w:eastAsiaTheme="majorEastAsia" w:hAnsiTheme="majorHAnsi" w:cstheme="majorBidi"/>
           <w:b/>
@@ -1111,6 +1115,11 @@
     </w:p>
     <w:p>
       <w:pPr>
+        <w:pStyle w:val="ListParagraph"/>
+        <w:numPr>
+          <w:ilvl w:val="0"/>
+          <w:numId w:val="14"/>
+        </w:numPr>
         <w:rPr>
           <w:rFonts w:asciiTheme="majorHAnsi" w:eastAsiaTheme="majorEastAsia" w:hAnsiTheme="majorHAnsi" w:cstheme="majorBidi"/>
           <w:b/>
@@ -1135,7 +1144,6 @@
           <w:szCs w:val="28"/>
           <w:lang w:val="es-MX"/>
         </w:rPr>
-        <w:lastRenderedPageBreak/>
         <w:t>Técnico Profesional en Operaciones Turísticas – Universidad Católica de Manizales</w:t>
       </w:r>
       <w:r>
@@ -1156,6 +1164,11 @@
     </w:p>
     <w:p>
       <w:pPr>
+        <w:pStyle w:val="ListParagraph"/>
+        <w:numPr>
+          <w:ilvl w:val="0"/>
+          <w:numId w:val="14"/>
+        </w:numPr>
         <w:rPr>
           <w:rFonts w:asciiTheme="majorHAnsi" w:eastAsiaTheme="majorEastAsia" w:hAnsiTheme="majorHAnsi" w:cstheme="majorBidi"/>
           <w:b/>
@@ -1260,6 +1273,11 @@
     </w:p>
     <w:p>
       <w:pPr>
+        <w:pStyle w:val="ListParagraph"/>
+        <w:numPr>
+          <w:ilvl w:val="0"/>
+          <w:numId w:val="16"/>
+        </w:numPr>
         <w:rPr>
           <w:rFonts w:asciiTheme="majorHAnsi" w:eastAsiaTheme="majorEastAsia" w:hAnsiTheme="majorHAnsi" w:cstheme="majorBidi"/>
           <w:b/>
@@ -1272,7 +1290,6 @@
           <w:lang w:val="es-MX"/>
         </w:rPr>
       </w:pPr>
-      <w:proofErr w:type="spellStart"/>
       <w:r>
         <w:rPr>
           <w:rFonts w:asciiTheme="majorHAnsi" w:eastAsiaTheme="majorEastAsia" w:hAnsiTheme="majorHAnsi" w:cstheme="majorBidi"/>
@@ -1285,9 +1302,28 @@
           <w:szCs w:val="28"/>
           <w:lang w:val="es-MX"/>
         </w:rPr>
-        <w:t>Bootcamp</w:t>
+        <w:t xml:space="preserve">Bootcamp de Programación Básica – MinTIC / Universidad de Caldas (2025) </w:t>
       </w:r>
-      <w:proofErr w:type="spellEnd"/>
+    </w:p>
+    <w:p>
+      <w:pPr>
+        <w:pStyle w:val="ListParagraph"/>
+        <w:numPr>
+          <w:ilvl w:val="0"/>
+          <w:numId w:val="16"/>
+        </w:numPr>
+        <w:rPr>
+          <w:rFonts w:asciiTheme="majorHAnsi" w:eastAsiaTheme="majorEastAsia" w:hAnsiTheme="majorHAnsi" w:cstheme="majorBidi"/>
+          <w:b/>
+          <w:bCs/>
+          <w:color w:val="000000" w:themeColor="text1"/>
+          <w:spacing w:val="5"/>
+          <w:kern w:val="28"/>
+          <w:sz w:val="28"/>
+          <w:szCs w:val="28"/>
+          <w:lang w:val="es-MX"/>
+        </w:rPr>
+      </w:pPr>
       <w:r>
         <w:rPr>
           <w:rFonts w:asciiTheme="majorHAnsi" w:eastAsiaTheme="majorEastAsia" w:hAnsiTheme="majorHAnsi" w:cstheme="majorBidi"/>
@@ -1300,22 +1336,7 @@
           <w:szCs w:val="28"/>
           <w:lang w:val="es-MX"/>
         </w:rPr>
-        <w:t xml:space="preserve"> de Programación Básica – MinTIC / Universidad de Caldas (2025) – 159 horas</w:t>
-      </w:r>
-      <w:r>
-        <w:rPr>
-          <w:rFonts w:asciiTheme="majorHAnsi" w:eastAsiaTheme="majorEastAsia" w:hAnsiTheme="majorHAnsi" w:cstheme="majorBidi"/>
-          <w:b/>
-          <w:bCs/>
-          <w:color w:val="000000" w:themeColor="text1"/>
-          <w:spacing w:val="5"/>
-          <w:kern w:val="28"/>
-          <w:sz w:val="28"/>
-          <w:szCs w:val="28"/>
-          <w:lang w:val="es-MX"/>
-        </w:rPr>
-        <w:br/>
-        <w:t>Diplomado en Inglés Comunicativo – Universidad Católica de Manizales (2020) – 200 horas</w:t>
+        <w:t xml:space="preserve">Diplomado en Inglés Comunicativo – Universidad Católica de Manizales (2020) </w:t>
       </w:r>
     </w:p>
     <w:p>
@@ -1346,139 +1367,6 @@
         </w:rPr>
         <w:pict w14:anchorId="5969670E">
           <v:rect id="_x0000_i1030" style="width:0;height:1.5pt" o:hralign="center" o:hrstd="t" o:hr="t" fillcolor="#a0a0a0" stroked="f"/>
-        </w:pict>
-      </w:r>
-    </w:p>
-    <w:p>
-      <w:pPr>
-        <w:rPr>
-          <w:rFonts w:asciiTheme="majorHAnsi" w:eastAsiaTheme="majorEastAsia" w:hAnsiTheme="majorHAnsi" w:cstheme="majorBidi"/>
-          <w:b/>
-          <w:bCs/>
-          <w:color w:val="1F497D" w:themeColor="text2"/>
-          <w:spacing w:val="5"/>
-          <w:kern w:val="28"/>
-          <w:sz w:val="28"/>
-          <w:szCs w:val="28"/>
-          <w:lang w:val="es-MX"/>
-        </w:rPr>
-      </w:pPr>
-      <w:r>
-        <w:rPr>
-          <w:rFonts w:asciiTheme="majorHAnsi" w:eastAsiaTheme="majorEastAsia" w:hAnsiTheme="majorHAnsi" w:cstheme="majorBidi"/>
-          <w:b/>
-          <w:bCs/>
-          <w:color w:val="1F497D" w:themeColor="text2"/>
-          <w:spacing w:val="5"/>
-          <w:kern w:val="28"/>
-          <w:sz w:val="28"/>
-          <w:szCs w:val="28"/>
-          <w:lang w:val="es-MX"/>
-        </w:rPr>
-        <w:t>IDIOMAS</w:t>
-      </w:r>
-    </w:p>
-    <w:p>
-      <w:pPr>
-        <w:rPr>
-          <w:rFonts w:asciiTheme="majorHAnsi" w:eastAsiaTheme="majorEastAsia" w:hAnsiTheme="majorHAnsi" w:cstheme="majorBidi"/>
-          <w:b/>
-          <w:bCs/>
-          <w:color w:val="000000" w:themeColor="text1"/>
-          <w:spacing w:val="5"/>
-          <w:kern w:val="28"/>
-          <w:sz w:val="28"/>
-          <w:szCs w:val="28"/>
-          <w:lang w:val="es-MX"/>
-        </w:rPr>
-      </w:pPr>
-      <w:r>
-        <w:rPr>
-          <w:rFonts w:asciiTheme="majorHAnsi" w:eastAsiaTheme="majorEastAsia" w:hAnsiTheme="majorHAnsi" w:cstheme="majorBidi"/>
-          <w:b/>
-          <w:bCs/>
-          <w:color w:val="000000" w:themeColor="text1"/>
-          <w:spacing w:val="5"/>
-          <w:kern w:val="28"/>
-          <w:sz w:val="28"/>
-          <w:szCs w:val="28"/>
-          <w:lang w:val="es-MX"/>
-        </w:rPr>
-        <w:t>Español: Nativo</w:t>
-      </w:r>
-      <w:r>
-        <w:rPr>
-          <w:rFonts w:asciiTheme="majorHAnsi" w:eastAsiaTheme="majorEastAsia" w:hAnsiTheme="majorHAnsi" w:cstheme="majorBidi"/>
-          <w:b/>
-          <w:bCs/>
-          <w:color w:val="000000" w:themeColor="text1"/>
-          <w:spacing w:val="5"/>
-          <w:kern w:val="28"/>
-          <w:sz w:val="28"/>
-          <w:szCs w:val="28"/>
-          <w:lang w:val="es-MX"/>
-        </w:rPr>
-        <w:br/>
-      </w:r>
-      <w:proofErr w:type="gramStart"/>
-      <w:r>
-        <w:rPr>
-          <w:rFonts w:asciiTheme="majorHAnsi" w:eastAsiaTheme="majorEastAsia" w:hAnsiTheme="majorHAnsi" w:cstheme="majorBidi"/>
-          <w:b/>
-          <w:bCs/>
-          <w:color w:val="000000" w:themeColor="text1"/>
-          <w:spacing w:val="5"/>
-          <w:kern w:val="28"/>
-          <w:sz w:val="28"/>
-          <w:szCs w:val="28"/>
-          <w:lang w:val="es-MX"/>
-        </w:rPr>
-        <w:t>Inglés</w:t>
-      </w:r>
-      <w:proofErr w:type="gramEnd"/>
-      <w:r>
-        <w:rPr>
-          <w:rFonts w:asciiTheme="majorHAnsi" w:eastAsiaTheme="majorEastAsia" w:hAnsiTheme="majorHAnsi" w:cstheme="majorBidi"/>
-          <w:b/>
-          <w:bCs/>
-          <w:color w:val="000000" w:themeColor="text1"/>
-          <w:spacing w:val="5"/>
-          <w:kern w:val="28"/>
-          <w:sz w:val="28"/>
-          <w:szCs w:val="28"/>
-          <w:lang w:val="es-MX"/>
-        </w:rPr>
-        <w:t>: Intermedio</w:t>
-      </w:r>
-    </w:p>
-    <w:p>
-      <w:pPr>
-        <w:rPr>
-          <w:rFonts w:asciiTheme="majorHAnsi" w:eastAsiaTheme="majorEastAsia" w:hAnsiTheme="majorHAnsi" w:cstheme="majorBidi"/>
-          <w:b/>
-          <w:bCs/>
-          <w:color w:val="17365D" w:themeColor="text2" w:themeShade="BF"/>
-          <w:spacing w:val="5"/>
-          <w:kern w:val="28"/>
-          <w:sz w:val="28"/>
-          <w:szCs w:val="28"/>
-          <w:lang w:val="es-MX"/>
-        </w:rPr>
-      </w:pPr>
-      <w:r>
-        <w:rPr>
-          <w:rFonts w:asciiTheme="majorHAnsi" w:eastAsiaTheme="majorEastAsia" w:hAnsiTheme="majorHAnsi" w:cstheme="majorBidi"/>
-          <w:b/>
-          <w:bCs/>
-          <w:color w:val="17365D" w:themeColor="text2" w:themeShade="BF"/>
-          <w:spacing w:val="5"/>
-          <w:kern w:val="28"/>
-          <w:sz w:val="28"/>
-          <w:szCs w:val="28"/>
-          <w:lang w:val="es-MX"/>
-        </w:rPr>
-        <w:pict w14:anchorId="3BA36E69">
-          <v:rect id="_x0000_i1031" style="width:0;height:1.5pt" o:hralign="center" o:hrstd="t" o:hr="t" fillcolor="#a0a0a0" stroked="f"/>
         </w:pict>
       </w:r>
     </w:p>
@@ -1823,6 +1711,232 @@
     </w:lvl>
   </w:abstractNum>
   <w:abstractNum w:abstractNumId="10" w15:restartNumberingAfterBreak="0">
+    <w:nsid w:val="18EA0878"/>
+    <w:multiLevelType w:val="hybridMultilevel"/>
+    <w:tmpl w:val="B3987842"/>
+    <w:lvl w:ilvl="0" w:tplc="080A0001">
+      <w:start w:val="1"/>
+      <w:numFmt w:val="bullet"/>
+      <w:lvlText w:val=""/>
+      <w:lvlJc w:val="left"/>
+      <w:pPr>
+        <w:ind w:left="720" w:hanging="360"/>
+      </w:pPr>
+      <w:rPr>
+        <w:rFonts w:ascii="Symbol" w:hAnsi="Symbol" w:hint="default"/>
+      </w:rPr>
+    </w:lvl>
+    <w:lvl w:ilvl="1" w:tplc="FFFFFFFF" w:tentative="1">
+      <w:start w:val="1"/>
+      <w:numFmt w:val="bullet"/>
+      <w:lvlText w:val="o"/>
+      <w:lvlJc w:val="left"/>
+      <w:pPr>
+        <w:ind w:left="1440" w:hanging="360"/>
+      </w:pPr>
+      <w:rPr>
+        <w:rFonts w:ascii="Courier New" w:hAnsi="Courier New" w:cs="Courier New" w:hint="default"/>
+      </w:rPr>
+    </w:lvl>
+    <w:lvl w:ilvl="2" w:tplc="FFFFFFFF" w:tentative="1">
+      <w:start w:val="1"/>
+      <w:numFmt w:val="bullet"/>
+      <w:lvlText w:val=""/>
+      <w:lvlJc w:val="left"/>
+      <w:pPr>
+        <w:ind w:left="2160" w:hanging="360"/>
+      </w:pPr>
+      <w:rPr>
+        <w:rFonts w:ascii="Wingdings" w:hAnsi="Wingdings" w:hint="default"/>
+      </w:rPr>
+    </w:lvl>
+    <w:lvl w:ilvl="3" w:tplc="FFFFFFFF" w:tentative="1">
+      <w:start w:val="1"/>
+      <w:numFmt w:val="bullet"/>
+      <w:lvlText w:val=""/>
+      <w:lvlJc w:val="left"/>
+      <w:pPr>
+        <w:ind w:left="2880" w:hanging="360"/>
+      </w:pPr>
+      <w:rPr>
+        <w:rFonts w:ascii="Symbol" w:hAnsi="Symbol" w:hint="default"/>
+      </w:rPr>
+    </w:lvl>
+    <w:lvl w:ilvl="4" w:tplc="FFFFFFFF" w:tentative="1">
+      <w:start w:val="1"/>
+      <w:numFmt w:val="bullet"/>
+      <w:lvlText w:val="o"/>
+      <w:lvlJc w:val="left"/>
+      <w:pPr>
+        <w:ind w:left="3600" w:hanging="360"/>
+      </w:pPr>
+      <w:rPr>
+        <w:rFonts w:ascii="Courier New" w:hAnsi="Courier New" w:cs="Courier New" w:hint="default"/>
+      </w:rPr>
+    </w:lvl>
+    <w:lvl w:ilvl="5" w:tplc="FFFFFFFF" w:tentative="1">
+      <w:start w:val="1"/>
+      <w:numFmt w:val="bullet"/>
+      <w:lvlText w:val=""/>
+      <w:lvlJc w:val="left"/>
+      <w:pPr>
+        <w:ind w:left="4320" w:hanging="360"/>
+      </w:pPr>
+      <w:rPr>
+        <w:rFonts w:ascii="Wingdings" w:hAnsi="Wingdings" w:hint="default"/>
+      </w:rPr>
+    </w:lvl>
+    <w:lvl w:ilvl="6" w:tplc="FFFFFFFF" w:tentative="1">
+      <w:start w:val="1"/>
+      <w:numFmt w:val="bullet"/>
+      <w:lvlText w:val=""/>
+      <w:lvlJc w:val="left"/>
+      <w:pPr>
+        <w:ind w:left="5040" w:hanging="360"/>
+      </w:pPr>
+      <w:rPr>
+        <w:rFonts w:ascii="Symbol" w:hAnsi="Symbol" w:hint="default"/>
+      </w:rPr>
+    </w:lvl>
+    <w:lvl w:ilvl="7" w:tplc="FFFFFFFF" w:tentative="1">
+      <w:start w:val="1"/>
+      <w:numFmt w:val="bullet"/>
+      <w:lvlText w:val="o"/>
+      <w:lvlJc w:val="left"/>
+      <w:pPr>
+        <w:ind w:left="5760" w:hanging="360"/>
+      </w:pPr>
+      <w:rPr>
+        <w:rFonts w:ascii="Courier New" w:hAnsi="Courier New" w:cs="Courier New" w:hint="default"/>
+      </w:rPr>
+    </w:lvl>
+    <w:lvl w:ilvl="8" w:tplc="FFFFFFFF" w:tentative="1">
+      <w:start w:val="1"/>
+      <w:numFmt w:val="bullet"/>
+      <w:lvlText w:val=""/>
+      <w:lvlJc w:val="left"/>
+      <w:pPr>
+        <w:ind w:left="6480" w:hanging="360"/>
+      </w:pPr>
+      <w:rPr>
+        <w:rFonts w:ascii="Wingdings" w:hAnsi="Wingdings" w:hint="default"/>
+      </w:rPr>
+    </w:lvl>
+  </w:abstractNum>
+  <w:abstractNum w:abstractNumId="11" w15:restartNumberingAfterBreak="0">
+    <w:nsid w:val="1A167162"/>
+    <w:multiLevelType w:val="hybridMultilevel"/>
+    <w:tmpl w:val="F96C4540"/>
+    <w:lvl w:ilvl="0" w:tplc="080A0001">
+      <w:start w:val="1"/>
+      <w:numFmt w:val="bullet"/>
+      <w:lvlText w:val=""/>
+      <w:lvlJc w:val="left"/>
+      <w:pPr>
+        <w:ind w:left="720" w:hanging="360"/>
+      </w:pPr>
+      <w:rPr>
+        <w:rFonts w:ascii="Symbol" w:hAnsi="Symbol" w:hint="default"/>
+      </w:rPr>
+    </w:lvl>
+    <w:lvl w:ilvl="1" w:tplc="080A0003" w:tentative="1">
+      <w:start w:val="1"/>
+      <w:numFmt w:val="bullet"/>
+      <w:lvlText w:val="o"/>
+      <w:lvlJc w:val="left"/>
+      <w:pPr>
+        <w:ind w:left="1440" w:hanging="360"/>
+      </w:pPr>
+      <w:rPr>
+        <w:rFonts w:ascii="Courier New" w:hAnsi="Courier New" w:cs="Courier New" w:hint="default"/>
+      </w:rPr>
+    </w:lvl>
+    <w:lvl w:ilvl="2" w:tplc="080A0005" w:tentative="1">
+      <w:start w:val="1"/>
+      <w:numFmt w:val="bullet"/>
+      <w:lvlText w:val=""/>
+      <w:lvlJc w:val="left"/>
+      <w:pPr>
+        <w:ind w:left="2160" w:hanging="360"/>
+      </w:pPr>
+      <w:rPr>
+        <w:rFonts w:ascii="Wingdings" w:hAnsi="Wingdings" w:hint="default"/>
+      </w:rPr>
+    </w:lvl>
+    <w:lvl w:ilvl="3" w:tplc="080A0001" w:tentative="1">
+      <w:start w:val="1"/>
+      <w:numFmt w:val="bullet"/>
+      <w:lvlText w:val=""/>
+      <w:lvlJc w:val="left"/>
+      <w:pPr>
+        <w:ind w:left="2880" w:hanging="360"/>
+      </w:pPr>
+      <w:rPr>
+        <w:rFonts w:ascii="Symbol" w:hAnsi="Symbol" w:hint="default"/>
+      </w:rPr>
+    </w:lvl>
+    <w:lvl w:ilvl="4" w:tplc="080A0003" w:tentative="1">
+      <w:start w:val="1"/>
+      <w:numFmt w:val="bullet"/>
+      <w:lvlText w:val="o"/>
+      <w:lvlJc w:val="left"/>
+      <w:pPr>
+        <w:ind w:left="3600" w:hanging="360"/>
+      </w:pPr>
+      <w:rPr>
+        <w:rFonts w:ascii="Courier New" w:hAnsi="Courier New" w:cs="Courier New" w:hint="default"/>
+      </w:rPr>
+    </w:lvl>
+    <w:lvl w:ilvl="5" w:tplc="080A0005" w:tentative="1">
+      <w:start w:val="1"/>
+      <w:numFmt w:val="bullet"/>
+      <w:lvlText w:val=""/>
+      <w:lvlJc w:val="left"/>
+      <w:pPr>
+        <w:ind w:left="4320" w:hanging="360"/>
+      </w:pPr>
+      <w:rPr>
+        <w:rFonts w:ascii="Wingdings" w:hAnsi="Wingdings" w:hint="default"/>
+      </w:rPr>
+    </w:lvl>
+    <w:lvl w:ilvl="6" w:tplc="080A0001" w:tentative="1">
+      <w:start w:val="1"/>
+      <w:numFmt w:val="bullet"/>
+      <w:lvlText w:val=""/>
+      <w:lvlJc w:val="left"/>
+      <w:pPr>
+        <w:ind w:left="5040" w:hanging="360"/>
+      </w:pPr>
+      <w:rPr>
+        <w:rFonts w:ascii="Symbol" w:hAnsi="Symbol" w:hint="default"/>
+      </w:rPr>
+    </w:lvl>
+    <w:lvl w:ilvl="7" w:tplc="080A0003" w:tentative="1">
+      <w:start w:val="1"/>
+      <w:numFmt w:val="bullet"/>
+      <w:lvlText w:val="o"/>
+      <w:lvlJc w:val="left"/>
+      <w:pPr>
+        <w:ind w:left="5760" w:hanging="360"/>
+      </w:pPr>
+      <w:rPr>
+        <w:rFonts w:ascii="Courier New" w:hAnsi="Courier New" w:cs="Courier New" w:hint="default"/>
+      </w:rPr>
+    </w:lvl>
+    <w:lvl w:ilvl="8" w:tplc="080A0005" w:tentative="1">
+      <w:start w:val="1"/>
+      <w:numFmt w:val="bullet"/>
+      <w:lvlText w:val=""/>
+      <w:lvlJc w:val="left"/>
+      <w:pPr>
+        <w:ind w:left="6480" w:hanging="360"/>
+      </w:pPr>
+      <w:rPr>
+        <w:rFonts w:ascii="Wingdings" w:hAnsi="Wingdings" w:hint="default"/>
+      </w:rPr>
+    </w:lvl>
+  </w:abstractNum>
+  <w:abstractNum w:abstractNumId="12" w15:restartNumberingAfterBreak="0">
     <w:nsid w:val="1B5A72A2"/>
     <w:multiLevelType w:val="multilevel"/>
     <w:tmpl w:val="07FEEEEE"/>
@@ -1971,7 +2085,120 @@
       </w:rPr>
     </w:lvl>
   </w:abstractNum>
-  <w:abstractNum w:abstractNumId="11" w15:restartNumberingAfterBreak="0">
+  <w:abstractNum w:abstractNumId="13" w15:restartNumberingAfterBreak="0">
+    <w:nsid w:val="2BDE1610"/>
+    <w:multiLevelType w:val="hybridMultilevel"/>
+    <w:tmpl w:val="2500C7CE"/>
+    <w:lvl w:ilvl="0" w:tplc="080A0001">
+      <w:start w:val="1"/>
+      <w:numFmt w:val="bullet"/>
+      <w:lvlText w:val=""/>
+      <w:lvlJc w:val="left"/>
+      <w:pPr>
+        <w:ind w:left="720" w:hanging="360"/>
+      </w:pPr>
+      <w:rPr>
+        <w:rFonts w:ascii="Symbol" w:hAnsi="Symbol" w:hint="default"/>
+      </w:rPr>
+    </w:lvl>
+    <w:lvl w:ilvl="1" w:tplc="080A0003" w:tentative="1">
+      <w:start w:val="1"/>
+      <w:numFmt w:val="bullet"/>
+      <w:lvlText w:val="o"/>
+      <w:lvlJc w:val="left"/>
+      <w:pPr>
+        <w:ind w:left="1440" w:hanging="360"/>
+      </w:pPr>
+      <w:rPr>
+        <w:rFonts w:ascii="Courier New" w:hAnsi="Courier New" w:cs="Courier New" w:hint="default"/>
+      </w:rPr>
+    </w:lvl>
+    <w:lvl w:ilvl="2" w:tplc="080A0005" w:tentative="1">
+      <w:start w:val="1"/>
+      <w:numFmt w:val="bullet"/>
+      <w:lvlText w:val=""/>
+      <w:lvlJc w:val="left"/>
+      <w:pPr>
+        <w:ind w:left="2160" w:hanging="360"/>
+      </w:pPr>
+      <w:rPr>
+        <w:rFonts w:ascii="Wingdings" w:hAnsi="Wingdings" w:hint="default"/>
+      </w:rPr>
+    </w:lvl>
+    <w:lvl w:ilvl="3" w:tplc="080A0001" w:tentative="1">
+      <w:start w:val="1"/>
+      <w:numFmt w:val="bullet"/>
+      <w:lvlText w:val=""/>
+      <w:lvlJc w:val="left"/>
+      <w:pPr>
+        <w:ind w:left="2880" w:hanging="360"/>
+      </w:pPr>
+      <w:rPr>
+        <w:rFonts w:ascii="Symbol" w:hAnsi="Symbol" w:hint="default"/>
+      </w:rPr>
+    </w:lvl>
+    <w:lvl w:ilvl="4" w:tplc="080A0003" w:tentative="1">
+      <w:start w:val="1"/>
+      <w:numFmt w:val="bullet"/>
+      <w:lvlText w:val="o"/>
+      <w:lvlJc w:val="left"/>
+      <w:pPr>
+        <w:ind w:left="3600" w:hanging="360"/>
+      </w:pPr>
+      <w:rPr>
+        <w:rFonts w:ascii="Courier New" w:hAnsi="Courier New" w:cs="Courier New" w:hint="default"/>
+      </w:rPr>
+    </w:lvl>
+    <w:lvl w:ilvl="5" w:tplc="080A0005" w:tentative="1">
+      <w:start w:val="1"/>
+      <w:numFmt w:val="bullet"/>
+      <w:lvlText w:val=""/>
+      <w:lvlJc w:val="left"/>
+      <w:pPr>
+        <w:ind w:left="4320" w:hanging="360"/>
+      </w:pPr>
+      <w:rPr>
+        <w:rFonts w:ascii="Wingdings" w:hAnsi="Wingdings" w:hint="default"/>
+      </w:rPr>
+    </w:lvl>
+    <w:lvl w:ilvl="6" w:tplc="080A0001" w:tentative="1">
+      <w:start w:val="1"/>
+      <w:numFmt w:val="bullet"/>
+      <w:lvlText w:val=""/>
+      <w:lvlJc w:val="left"/>
+      <w:pPr>
+        <w:ind w:left="5040" w:hanging="360"/>
+      </w:pPr>
+      <w:rPr>
+        <w:rFonts w:ascii="Symbol" w:hAnsi="Symbol" w:hint="default"/>
+      </w:rPr>
+    </w:lvl>
+    <w:lvl w:ilvl="7" w:tplc="080A0003" w:tentative="1">
+      <w:start w:val="1"/>
+      <w:numFmt w:val="bullet"/>
+      <w:lvlText w:val="o"/>
+      <w:lvlJc w:val="left"/>
+      <w:pPr>
+        <w:ind w:left="5760" w:hanging="360"/>
+      </w:pPr>
+      <w:rPr>
+        <w:rFonts w:ascii="Courier New" w:hAnsi="Courier New" w:cs="Courier New" w:hint="default"/>
+      </w:rPr>
+    </w:lvl>
+    <w:lvl w:ilvl="8" w:tplc="080A0005" w:tentative="1">
+      <w:start w:val="1"/>
+      <w:numFmt w:val="bullet"/>
+      <w:lvlText w:val=""/>
+      <w:lvlJc w:val="left"/>
+      <w:pPr>
+        <w:ind w:left="6480" w:hanging="360"/>
+      </w:pPr>
+      <w:rPr>
+        <w:rFonts w:ascii="Wingdings" w:hAnsi="Wingdings" w:hint="default"/>
+      </w:rPr>
+    </w:lvl>
+  </w:abstractNum>
+  <w:abstractNum w:abstractNumId="14" w15:restartNumberingAfterBreak="0">
     <w:nsid w:val="314F587E"/>
     <w:multiLevelType w:val="multilevel"/>
     <w:tmpl w:val="2E3647B6"/>
@@ -2120,7 +2347,7 @@
       </w:rPr>
     </w:lvl>
   </w:abstractNum>
-  <w:abstractNum w:abstractNumId="12" w15:restartNumberingAfterBreak="0">
+  <w:abstractNum w:abstractNumId="15" w15:restartNumberingAfterBreak="0">
     <w:nsid w:val="563B69BE"/>
     <w:multiLevelType w:val="multilevel"/>
     <w:tmpl w:val="DCBCC746"/>
@@ -2297,16 +2524,25 @@
     <w:abstractNumId w:val="0"/>
   </w:num>
   <w:num w:numId="10" w16cid:durableId="1872106167">
-    <w:abstractNumId w:val="10"/>
+    <w:abstractNumId w:val="12"/>
   </w:num>
   <w:num w:numId="11" w16cid:durableId="216818009">
     <w:abstractNumId w:val="9"/>
   </w:num>
   <w:num w:numId="12" w16cid:durableId="1239905467">
+    <w:abstractNumId w:val="14"/>
+  </w:num>
+  <w:num w:numId="13" w16cid:durableId="1123228387">
+    <w:abstractNumId w:val="15"/>
+  </w:num>
+  <w:num w:numId="14" w16cid:durableId="1930234467">
     <w:abstractNumId w:val="11"/>
   </w:num>
-  <w:num w:numId="13" w16cid:durableId="1123228387">
-    <w:abstractNumId w:val="12"/>
+  <w:num w:numId="15" w16cid:durableId="1923945704">
+    <w:abstractNumId w:val="13"/>
+  </w:num>
+  <w:num w:numId="16" w16cid:durableId="148861908">
+    <w:abstractNumId w:val="10"/>
   </w:num>
 </w:numbering>
 </file>

</xml_diff>